<commit_message>
Rewrite thesis from scratch in Turkish with proper academic formatting and no control chars
</commit_message>
<xml_diff>
--- a/graduation_thesis/BorsaNeuron_Graduation_Thesis_v4.docx
+++ b/graduation_thesis/BorsaNeuron_Graduation_Thesis_v4.docx
@@ -23,7 +23,7 @@
           <w:rFonts w:ascii="Times New Roman" w:hAnsi="Times New Roman"/>
           <w:sz w:val="24"/>
         </w:rPr>
-        <w:t>YEDITEPE UNIVERSITY</w:t>
+        <w:t>YEDİTEPE ÜNİVERSİTESİ</w:t>
       </w:r>
     </w:p>
     <w:p>
@@ -35,7 +35,7 @@
           <w:rFonts w:ascii="Times New Roman" w:hAnsi="Times New Roman"/>
           <w:sz w:val="24"/>
         </w:rPr>
-        <w:t>FACULTY OF COMMERCE</w:t>
+        <w:t>TİCARİ BİLİMLER FAKÜLTESİ</w:t>
       </w:r>
     </w:p>
     <w:p>
@@ -47,7 +47,7 @@
           <w:rFonts w:ascii="Times New Roman" w:hAnsi="Times New Roman"/>
           <w:sz w:val="24"/>
         </w:rPr>
-        <w:t>DEPARTMENT OF MANAGEMENT INFORMATION SYSTEMS</w:t>
+        <w:t>YÖNETİM BİLİŞİM SİSTEMLERİ BÖLÜMÜ</w:t>
       </w:r>
     </w:p>
     <w:p/>
@@ -73,7 +73,7 @@
           <w:b/>
           <w:sz w:val="40"/>
         </w:rPr>
-        <w:t>BORSANEURON: ALGORITHMIC STOCK PRICE FORECASTING AND AUTOMATED TECHNICAL PATTERN SCANNER PLATFORM</w:t>
+        <w:t>BORSANEURON: ALGORİTMİK HİSSE SENEDİ FİYAT TAHMİNLEMESİ VE OTOMATİK TEKNİK ÖRÜNTÜ TARAYICI PLATFORMU</w:t>
       </w:r>
     </w:p>
     <w:p>
@@ -112,7 +112,7 @@
           <w:b/>
           <w:sz w:val="28"/>
         </w:rPr>
-        <w:t>Graduation Thesis</w:t>
+        <w:t>Lisans Tezi</w:t>
       </w:r>
     </w:p>
     <w:p>
@@ -125,7 +125,7 @@
           <w:b/>
           <w:sz w:val="28"/>
         </w:rPr>
-        <w:t>by</w:t>
+        <w:t>hazırlayan</w:t>
       </w:r>
     </w:p>
     <w:p>
@@ -177,7 +177,7 @@
           <w:b/>
           <w:sz w:val="28"/>
         </w:rPr>
-        <w:t>Thesis Supervisor: Dr. Öğr. Üyesi UĞUR TEVFİK KAPLANCALI</w:t>
+        <w:t>Tez Danışmanı: Dr. Öğr. Üyesi UĞUR TEVFİK KAPLANCALI</w:t>
       </w:r>
     </w:p>
     <w:p/>
@@ -203,7 +203,7 @@
           <w:b/>
           <w:sz w:val="28"/>
         </w:rPr>
-        <w:t>ISTANBUL, SPRING 2026</w:t>
+        <w:t>İSTANBUL, BAHAR 2026</w:t>
       </w:r>
     </w:p>
     <w:p/>
@@ -225,7 +225,7 @@
           <w:color w:val="111111"/>
           <w:sz w:val="36"/>
         </w:rPr>
-        <w:t>CONTENTS</w:t>
+        <w:t>İÇİNDEKİLER</w:t>
       </w:r>
     </w:p>
     <w:p>
@@ -264,7 +264,7 @@
           <w:rFonts w:ascii="Times New Roman" w:hAnsi="Times New Roman"/>
           <w:sz w:val="24"/>
         </w:rPr>
-        <w:t>1. INTRODUCTION 3</w:t>
+        <w:t>1. GİRİŞ  4</w:t>
       </w:r>
     </w:p>
     <w:p>
@@ -277,7 +277,7 @@
           <w:rFonts w:ascii="Times New Roman" w:hAnsi="Times New Roman"/>
           <w:sz w:val="24"/>
         </w:rPr>
-        <w:t>2. SETTING UP PROJECT 4</w:t>
+        <w:t>2. PROJE KURULUMU  5</w:t>
       </w:r>
     </w:p>
     <w:p>
@@ -290,7 +290,7 @@
           <w:rFonts w:ascii="Times New Roman" w:hAnsi="Times New Roman"/>
           <w:sz w:val="24"/>
         </w:rPr>
-        <w:t>2.1. Software Required Before Installation 4</w:t>
+        <w:t>2.1. Kurulum Öncesi Gerekli Yazılımlar  5</w:t>
       </w:r>
     </w:p>
     <w:p>
@@ -303,7 +303,7 @@
           <w:rFonts w:ascii="Times New Roman" w:hAnsi="Times New Roman"/>
           <w:sz w:val="24"/>
         </w:rPr>
-        <w:t>2.2. Initial Installation Packages of the Project 6</w:t>
+        <w:t>2.2. Projenin Başlangıç Kurulum Paketleri  6</w:t>
       </w:r>
     </w:p>
     <w:p>
@@ -316,7 +316,7 @@
           <w:rFonts w:ascii="Times New Roman" w:hAnsi="Times New Roman"/>
           <w:sz w:val="24"/>
         </w:rPr>
-        <w:t>3. BUILDING BORSANEURON PLATFORM &amp; MODULES 8</w:t>
+        <w:t>3. BORSANEURON PLATFORMU VE MODÜLLERİNİN İNŞASI  8</w:t>
       </w:r>
     </w:p>
     <w:p>
@@ -329,7 +329,7 @@
           <w:rFonts w:ascii="Times New Roman" w:hAnsi="Times New Roman"/>
           <w:sz w:val="24"/>
         </w:rPr>
-        <w:t>3.1. Quantitative Data Pipeline 8</w:t>
+        <w:t>3.1. Nicel Veri Hattı  8</w:t>
       </w:r>
     </w:p>
     <w:p>
@@ -342,7 +342,7 @@
           <w:rFonts w:ascii="Times New Roman" w:hAnsi="Times New Roman"/>
           <w:sz w:val="24"/>
         </w:rPr>
-        <w:t>3.1.1. Pearson Correlation Filtering 8</w:t>
+        <w:t>3.1.1. Pearson Korelasyon Filtrelemesi  8</w:t>
       </w:r>
     </w:p>
     <w:p>
@@ -355,7 +355,7 @@
           <w:rFonts w:ascii="Times New Roman" w:hAnsi="Times New Roman"/>
           <w:sz w:val="24"/>
         </w:rPr>
-        <w:t>3.1.2. K-Means Market Segmentation 10</w:t>
+        <w:t>3.1.2. K-Means Pazar Segmentasyonu  10</w:t>
       </w:r>
     </w:p>
     <w:p>
@@ -368,7 +368,7 @@
           <w:rFonts w:ascii="Times New Roman" w:hAnsi="Times New Roman"/>
           <w:sz w:val="24"/>
         </w:rPr>
-        <w:t>3.1.3. LZMA xz Data Compression Workaround 12</w:t>
+        <w:t>3.1.3. LZMA xz Veri Sıkıştırma Çözümü  12</w:t>
       </w:r>
     </w:p>
     <w:p>
@@ -381,7 +381,7 @@
           <w:rFonts w:ascii="Times New Roman" w:hAnsi="Times New Roman"/>
           <w:sz w:val="24"/>
         </w:rPr>
-        <w:t>3.2. Supervised Machine Learning Engines 14</w:t>
+        <w:t>3.2. Denetimli Makine Öğrenmesi Motorları  14</w:t>
       </w:r>
     </w:p>
     <w:p>
@@ -394,7 +394,7 @@
           <w:rFonts w:ascii="Times New Roman" w:hAnsi="Times New Roman"/>
           <w:sz w:val="24"/>
         </w:rPr>
-        <w:t>3.2.1. Hyperparameter Optimization (K-NN &amp; GridSearchCV) 14</w:t>
+        <w:t>3.2.1. Hiperparametre Optimizasyonu (K-NN ve GridSearchCV)  14</w:t>
       </w:r>
     </w:p>
     <w:p>
@@ -407,7 +407,7 @@
           <w:rFonts w:ascii="Times New Roman" w:hAnsi="Times New Roman"/>
           <w:sz w:val="24"/>
         </w:rPr>
-        <w:t>3.2.2. Random Forest Gini Feature Importances 16</w:t>
+        <w:t>3.2.2. Random Forest Gini Özellik Önem Dereceleri  16</w:t>
       </w:r>
     </w:p>
     <w:p>
@@ -420,7 +420,7 @@
           <w:rFonts w:ascii="Times New Roman" w:hAnsi="Times New Roman"/>
           <w:sz w:val="24"/>
         </w:rPr>
-        <w:t>3.2.3. Artificial Neural Networks (ANN MLPClassifier) 18</w:t>
+        <w:t>3.2.3. Yapay Sinir Ağları (ANN MLPClassifier)  18</w:t>
       </w:r>
     </w:p>
     <w:p>
@@ -433,7 +433,7 @@
           <w:rFonts w:ascii="Times New Roman" w:hAnsi="Times New Roman"/>
           <w:sz w:val="24"/>
         </w:rPr>
-        <w:t>3.2.4. Core Production XGBoost Classifier 20</w:t>
+        <w:t>3.2.4. Üretim Aşaması XGBoost Sınıflandırma Modeli  20</w:t>
       </w:r>
     </w:p>
     <w:p>
@@ -446,7 +446,7 @@
           <w:rFonts w:ascii="Times New Roman" w:hAnsi="Times New Roman"/>
           <w:sz w:val="24"/>
         </w:rPr>
-        <w:t>3.3. Streamlit Workstation Interface 22</w:t>
+        <w:t>3.3. Streamlit İş İstasyonu Arayüzü  22</w:t>
       </w:r>
     </w:p>
     <w:p>
@@ -459,7 +459,7 @@
           <w:rFonts w:ascii="Times New Roman" w:hAnsi="Times New Roman"/>
           <w:sz w:val="24"/>
         </w:rPr>
-        <w:t>3.3.1. Glassmorphic SaaS Layout &amp; Custom CSS Injection 22</w:t>
+        <w:t>3.3.1. Glassmorphic SaaS Düzeni ve Özel CSS Enjeksiyonu  22</w:t>
       </w:r>
     </w:p>
     <w:p>
@@ -472,7 +472,7 @@
           <w:rFonts w:ascii="Times New Roman" w:hAnsi="Times New Roman"/>
           <w:sz w:val="24"/>
         </w:rPr>
-        <w:t>3.3.2. Live Stock Query Page &amp; yfinance Inference Pipeline 24</w:t>
+        <w:t>3.3.2. Canlı Hisse Sorgulama Sayfası ve yfinance Çıkarım Hattı  24</w:t>
       </w:r>
     </w:p>
     <w:p>
@@ -485,7 +485,7 @@
           <w:rFonts w:ascii="Times New Roman" w:hAnsi="Times New Roman"/>
           <w:sz w:val="24"/>
         </w:rPr>
-        <w:t>3.3.3. Historical Win-Rate Decision Engine 26</w:t>
+        <w:t>3.3.3. Tarihsel Başarı Oranı (Win Rate) Karar Motoru  26</w:t>
       </w:r>
     </w:p>
     <w:p>
@@ -498,7 +498,7 @@
           <w:rFonts w:ascii="Times New Roman" w:hAnsi="Times New Roman"/>
           <w:sz w:val="24"/>
         </w:rPr>
-        <w:t>3.3.4. Sector Peer Benchmarking 28</w:t>
+        <w:t>3.3.4. Sektörel Akran Kıyaslaması  28</w:t>
       </w:r>
     </w:p>
     <w:p>
@@ -511,7 +511,7 @@
           <w:rFonts w:ascii="Times New Roman" w:hAnsi="Times New Roman"/>
           <w:sz w:val="24"/>
         </w:rPr>
-        <w:t>3.3.5. Interactive Candlestick Plotly Visualizer 30</w:t>
+        <w:t>3.3.5. İnteraktif Grafik Görselleştirici (Plotly)  30</w:t>
       </w:r>
     </w:p>
     <w:p>
@@ -524,7 +524,7 @@
           <w:rFonts w:ascii="Times New Roman" w:hAnsi="Times New Roman"/>
           <w:sz w:val="24"/>
         </w:rPr>
-        <w:t>3.3.6. Live Portfolio Backtest Simulator 32</w:t>
+        <w:t>3.3.6. Canlı Portföy Simülasyonu  32</w:t>
       </w:r>
     </w:p>
     <w:p>
@@ -537,7 +537,7 @@
           <w:rFonts w:ascii="Times New Roman" w:hAnsi="Times New Roman"/>
           <w:sz w:val="24"/>
         </w:rPr>
-        <w:t>3.4. Automated Geometric Pattern Recognition Engine 34</w:t>
+        <w:t>3.4. Otomatik Geometrik Formasyon Tanıma Motoru  34</w:t>
       </w:r>
     </w:p>
     <w:p>
@@ -550,7 +550,7 @@
           <w:rFonts w:ascii="Times New Roman" w:hAnsi="Times New Roman"/>
           <w:sz w:val="24"/>
         </w:rPr>
-        <w:t>3.4.1. Peak and Trough Extraction via ZigZag Indicator 34</w:t>
+        <w:t>3.4.1. ZigZag İndikatörü ile Tepe ve Dip Noktalarının Çıkarılması  34</w:t>
       </w:r>
     </w:p>
     <w:p>
@@ -563,7 +563,7 @@
           <w:rFonts w:ascii="Times New Roman" w:hAnsi="Times New Roman"/>
           <w:sz w:val="24"/>
         </w:rPr>
-        <w:t>3.4.2. Head and Shoulders (OBO) &amp; Inverted Head and Shoulders (TOBO) 35</w:t>
+        <w:t>3.4.2. Omuz-Baş-Omuz (OBO) ve Ters Omuz-Baş-Omuz (TOBO) Formasyonları  35</w:t>
       </w:r>
     </w:p>
     <w:p>
@@ -576,7 +576,7 @@
           <w:rFonts w:ascii="Times New Roman" w:hAnsi="Times New Roman"/>
           <w:sz w:val="24"/>
         </w:rPr>
-        <w:t>3.4.3. Cup &amp; Handle &amp; Flag Formations 36</w:t>
+        <w:t>3.4.3. Çanak-Kulp ve Bayrak Formasyonları  36</w:t>
       </w:r>
     </w:p>
     <w:p>
@@ -589,7 +589,7 @@
           <w:rFonts w:ascii="Times New Roman" w:hAnsi="Times New Roman"/>
           <w:sz w:val="24"/>
         </w:rPr>
-        <w:t>3.4.4. Double Bottom &amp; Double Top Formations 37</w:t>
+        <w:t>3.4.4. İkili Dip ve İkili Tepe Formasyonları  37</w:t>
       </w:r>
     </w:p>
     <w:p>
@@ -602,7 +602,7 @@
           <w:rFonts w:ascii="Times New Roman" w:hAnsi="Times New Roman"/>
           <w:sz w:val="24"/>
         </w:rPr>
-        <w:t>4. DEPLOYING PROJECT 38</w:t>
+        <w:t>4. PROJENİN YAYINA ALINMASI VE DAĞITIMI  38</w:t>
       </w:r>
     </w:p>
     <w:p>
@@ -615,7 +615,7 @@
           <w:rFonts w:ascii="Times New Roman" w:hAnsi="Times New Roman"/>
           <w:sz w:val="24"/>
         </w:rPr>
-        <w:t>4.1. Docker Containerization 38</w:t>
+        <w:t>4.1. Docker ile Konteynerleştirme  38</w:t>
       </w:r>
     </w:p>
     <w:p>
@@ -628,7 +628,7 @@
           <w:rFonts w:ascii="Times New Roman" w:hAnsi="Times New Roman"/>
           <w:sz w:val="24"/>
         </w:rPr>
-        <w:t>4.2. Production Setup and Server Run Commands 39</w:t>
+        <w:t>4.2. Canlı Sunucu Kurulumu ve Çalıştırma Komutları  39</w:t>
       </w:r>
     </w:p>
     <w:p>
@@ -641,7 +641,7 @@
           <w:rFonts w:ascii="Times New Roman" w:hAnsi="Times New Roman"/>
           <w:sz w:val="24"/>
         </w:rPr>
-        <w:t>5. FILE HIERARCHY 39</w:t>
+        <w:t>5. DOSYA HİYERARŞİSİ  39</w:t>
       </w:r>
     </w:p>
     <w:p>
@@ -654,7 +654,7 @@
           <w:rFonts w:ascii="Times New Roman" w:hAnsi="Times New Roman"/>
           <w:sz w:val="24"/>
         </w:rPr>
-        <w:t>TECH STACK 40</w:t>
+        <w:t>6. KISITLAR VE GELECEK ÇALIŞMALAR  40</w:t>
       </w:r>
     </w:p>
     <w:p>
@@ -667,7 +667,20 @@
           <w:rFonts w:ascii="Times New Roman" w:hAnsi="Times New Roman"/>
           <w:sz w:val="24"/>
         </w:rPr>
-        <w:t>REFERENCES 41</w:t>
+        <w:t>TEKNOLOJİ YIĞINI  41</w:t>
+      </w:r>
+    </w:p>
+    <w:p>
+      <w:pPr>
+        <w:pStyle w:val="ListBullet"/>
+        <w:spacing w:after="80" w:line="276" w:lineRule="auto"/>
+      </w:pPr>
+      <w:r>
+        <w:rPr>
+          <w:rFonts w:ascii="Times New Roman" w:hAnsi="Times New Roman"/>
+          <w:sz w:val="24"/>
+        </w:rPr>
+        <w:t>KAYNAKÇA  42</w:t>
       </w:r>
     </w:p>
     <w:p>
@@ -798,7 +811,7 @@
           <w:rFonts w:ascii="Times New Roman" w:hAnsi="Times New Roman"/>
           <w:sz w:val="24"/>
         </w:rPr>
-        <w:t xml:space="preserve"> üzerinden akan canlı teknik verilerle anlık inference tahminleri alabildiği, hisselerin </w:t>
+        <w:t xml:space="preserve"> üzerinden akan canlı teknik verilerle anlık çıkarım tahminleri alabildiği, hisselerin </w:t>
       </w:r>
       <w:r>
         <w:rPr>
@@ -1007,7 +1020,7 @@
           <w:color w:val="111111"/>
           <w:sz w:val="36"/>
         </w:rPr>
-        <w:t>1. INTRODUCTION</w:t>
+        <w:t>1. GİRİŞ</w:t>
       </w:r>
     </w:p>
     <w:p>
@@ -1020,7 +1033,7 @@
           <w:rFonts w:ascii="Times New Roman" w:hAnsi="Times New Roman"/>
           <w:sz w:val="24"/>
         </w:rPr>
-        <w:t xml:space="preserve">This study presents </w:t>
+        <w:t xml:space="preserve">Bu çalışma, teknik analiz indikatörlerini ve makine öğrenmesi algoritmalarını kullanarak Borsa İstanbul (BIST) pay piyasalarındaki hisse senetlerinin 5 günlük gelecek fiyat yönünü tahmin etmeyi ve klasik grafik formasyonlarını otomatik olarak taramayı amaçlayan bütünsel bir karar destek ve veri analiz arayüzü olan </w:t>
       </w:r>
       <w:r>
         <w:rPr>
@@ -1035,7 +1048,7 @@
           <w:rFonts w:ascii="Times New Roman" w:hAnsi="Times New Roman"/>
           <w:sz w:val="24"/>
         </w:rPr>
-        <w:t>, a holistic decision support and analytics platform aimed at forecasting 5-day future stock price directions and automating classical chart pattern scanning in the Borsa Istanbul (BIST) stock market using technical analysis indicators and machine learning algorithms.</w:t>
+        <w:t xml:space="preserve"> platformunu sunmaktadır.</w:t>
       </w:r>
     </w:p>
     <w:p>
@@ -1048,22 +1061,7 @@
           <w:rFonts w:ascii="Times New Roman" w:hAnsi="Times New Roman"/>
           <w:sz w:val="24"/>
         </w:rPr>
-        <w:t xml:space="preserve">Applying quantitative finance workflows to quantitative finance, this project was developed using a comprehensive technical indicator dataset representing </w:t>
-      </w:r>
-      <w:r>
-        <w:rPr>
-          <w:rFonts w:ascii="Times New Roman" w:hAnsi="Times New Roman"/>
-          <w:b/>
-          <w:sz w:val="24"/>
-        </w:rPr>
-        <w:t>active BIST stocks</w:t>
-      </w:r>
-      <w:r>
-        <w:rPr>
-          <w:rFonts w:ascii="Times New Roman" w:hAnsi="Times New Roman"/>
-          <w:sz w:val="24"/>
-        </w:rPr>
-        <w:t xml:space="preserve"> traded on Borsa Istanbul. Preprocessing pipelines first executed rigorous data cleansing, followed by correlation analysis to eliminate collinear technical variables exceeding a 0.90 threshold. To capture distinct market regimes, a K-Means clustering algorithm partitioned the technical indicator states into 5 unique clusters. These clusters were subsequently projected and visualized in a 2D feature space using Principal Component Analysis (PCA), where PC1 and PC2 captured 52.25% of the cumulative variance.</w:t>
+        <w:t>Kantitatif finans ve veri madenciliği prensiplerinin uygulandığı bu projede, Borsa İstanbul bünyesinde işlem gören aktif hisselere ait geniş bir tarihsel veri havuzu kullanılmıştır. Geliştirilen veri mühendisliği hatları öncelikle eksik verileri temizlemiş, ardından değişkenler arasında $0.90$ eşiğini aşan çoklu doğrusal bağlantıyı önlemek için Pearson korelasyon analizi gerçekleştirmiştir. Piyasadaki farklı teknik koşulları ve rejimleri yakalamak amacıyla, K-Means kümeleme algoritması indikatör durumlarını 5 benzersiz kümeye bölmüştür. Bu kümeler daha sonra Temel Bileşenler Analizi (PCA) yardımıyla iki boyutlu bir özellik uzayına yansıtılmış ve PC1 ile PC2'nin toplam varyansın %52.25'ini açıkladığı gösterilmiştir.</w:t>
       </w:r>
     </w:p>
     <w:p>
@@ -1076,7 +1074,7 @@
           <w:rFonts w:ascii="Times New Roman" w:hAnsi="Times New Roman"/>
           <w:sz w:val="24"/>
         </w:rPr>
-        <w:t>To forecast the binary 5-day future price direction target (</w:t>
+        <w:t>Hisselerin 5 günlük fiyat yönü hedefini (</w:t>
       </w:r>
       <w:r>
         <w:rPr>
@@ -1090,7 +1088,7 @@
           <w:rFonts w:ascii="Times New Roman" w:hAnsi="Times New Roman"/>
           <w:sz w:val="24"/>
         </w:rPr>
-        <w:t>), K-Nearest Neighbors (K-NN), Artificial Neural Networks (ANN - MLPClassifier), and Random Forest (RF) classifiers were optimized. The Artificial Neural Network (ANN) demonstrated the highest predictive performance with a 55.68% accuracy and a 0.6496 F1-Score. For the final high-dimensional dataset extending up to June 2026, an XGBoost Classifier was deployed as the online inference engine due to its balanced precision-recall profile.</w:t>
+        <w:t>) tahmin etmek üzere K-En Yakın Komşu (K-NN), Yapay Sinir Ağları (ANN - MLPClassifier) ve Rastgele Orman (RF) modelleri optimize edilmiştir. Yapay Sinir Ağı (ANN) modeli %55.68 doğruluk oranı ve 0.6496 F1-Skoru ile test verilerinde en yüksek genel tahminsel doğruluğu sergilemiştir. Sistem verilerinin Haziran 2026 dönemine kadar genişletilmesiyle oluşturulan yüksek boyutlu üretim veri setinde ise dengeli hassasiyet ve duyarlılık (precision-recall) profili nedeniyle XGBoost Sınıflandırma algoritması çevrimiçi tahmin motoru olarak devreye alınmıştır.</w:t>
       </w:r>
     </w:p>
     <w:p>
@@ -1103,7 +1101,7 @@
           <w:rFonts w:ascii="Times New Roman" w:hAnsi="Times New Roman"/>
           <w:sz w:val="24"/>
         </w:rPr>
-        <w:t xml:space="preserve">To convert these quantitative pipelines into an active business intelligence tool, an interactive web application (BorsaNeuron Dashboard) was developed using the Python Streamlit library. The platform enables users to query any BIST ticker dynamically, fetch live technical data flows via </w:t>
+        <w:t xml:space="preserve">Sayısal modelleme hatlarını canlı bir iş zekası aracına dönüştürmek amacıyla, Python Streamlit kütüphanesi kullanılarak interaktif bir web paneli (BorsaNeuron Dashboard) inşa edilmiştir. Platform kullanıcıların BIST hisse kodlarını dinamik olarak sorgulamalarına, </w:t>
       </w:r>
       <w:r>
         <w:rPr>
@@ -1117,7 +1115,7 @@
           <w:rFonts w:ascii="Times New Roman" w:hAnsi="Times New Roman"/>
           <w:sz w:val="24"/>
         </w:rPr>
-        <w:t xml:space="preserve">, adjust decision metrics based on the stock's </w:t>
+        <w:t xml:space="preserve"> üzerinden akan canlı fiyat verileriyle anlık tahminler üretmelerine, risk eşiklerini hissenin </w:t>
       </w:r>
       <w:r>
         <w:rPr>
@@ -1125,14 +1123,14 @@
           <w:b/>
           <w:sz w:val="24"/>
         </w:rPr>
-        <w:t>unique historical win rate weight</w:t>
-      </w:r>
-      <w:r>
-        <w:rPr>
-          <w:rFonts w:ascii="Times New Roman" w:hAnsi="Times New Roman"/>
-          <w:sz w:val="24"/>
-        </w:rPr>
-        <w:t>, and trigger automated scans to identify geometric chart formations such as Head and Shoulders (TOBO), Cup and Handle, Flag, Double Bottom, and Double Top formations. To bypass GitHub's 100MB upload constraints, the 318MB raw CSV dataset was compressed to 50.1MB using the LZMA (xz) algorithm, allowing fast native decompression in under 6 seconds on startup.</w:t>
+        <w:t>tarihsel başarı oranına (Win Rate)</w:t>
+      </w:r>
+      <w:r>
+        <w:rPr>
+          <w:rFonts w:ascii="Times New Roman" w:hAnsi="Times New Roman"/>
+          <w:sz w:val="24"/>
+        </w:rPr>
+        <w:t xml:space="preserve"> göre ayarlamalarına ve TOBO, OBO, Çanak-Kulp, Flama, İkili Dip ve İkili Tepe gibi geometrik fiyat oluşumlarını otomatik olarak taramalarına olanak tanır. GitHub'ın 100MB'lık doğrudan dosya yükleme limitini aşmak amacıyla, 318MB boyutundaki ham veri seti LZMA (xz) algoritmasıyla 50.1MB'a sıkıştırılmış ve sistem açılışında 6 saniyenin altında dinamik olarak bellek üzerinde açılacak şekilde entegre edilmiştir.</w:t>
       </w:r>
     </w:p>
     <w:p>
@@ -1146,14 +1144,14 @@
           <w:b/>
           <w:sz w:val="24"/>
         </w:rPr>
-        <w:t>Keywords:</w:t>
-      </w:r>
-      <w:r>
-        <w:rPr>
-          <w:rFonts w:ascii="Times New Roman" w:hAnsi="Times New Roman"/>
-          <w:sz w:val="24"/>
-        </w:rPr>
-        <w:t xml:space="preserve"> Data Mining, BIST Forecasting, Machine Learning, K-Means Clustering, Sector Peer Analysis, Streamlit, Technical Pattern Scanner.</w:t>
+        <w:t>Anahtar Kelimeler:</w:t>
+      </w:r>
+      <w:r>
+        <w:rPr>
+          <w:rFonts w:ascii="Times New Roman" w:hAnsi="Times New Roman"/>
+          <w:sz w:val="24"/>
+        </w:rPr>
+        <w:t xml:space="preserve"> Veri Madenciliği, BIST Tahminlemesi, Makine Öğrenmesi, K-Means Kümeleme, Sektörel Kıyaslama, Streamlit, Teknik Formasyon Tarayıcı.</w:t>
       </w:r>
     </w:p>
     <w:p>
@@ -1174,7 +1172,7 @@
           <w:color w:val="111111"/>
           <w:sz w:val="36"/>
         </w:rPr>
-        <w:t>2. SETTING UP PROJECT</w:t>
+        <w:t>2. PROJE KURULUMU</w:t>
       </w:r>
     </w:p>
     <w:p>
@@ -1187,7 +1185,7 @@
           <w:rFonts w:ascii="Times New Roman" w:hAnsi="Times New Roman"/>
           <w:sz w:val="24"/>
         </w:rPr>
-        <w:t>In the project, first of all, we need to install the relevant software and libraries that provide a quantitative development environment on our local computer. These tools provide us with a shell to run modeling scripts, train classifiers, and boot the web dashboard. After preparing the environment, we will install the packages from our terminal.</w:t>
+        <w:t>Projeyi çalıştırmak ve model geliştirme süreçlerini yerel bilgisayarınızda tekrarlayabilmek için öncelikle uygun veri madenciliği ve programlama ortamının kurulması gerekmektedir. Bu araçlar bize veri önişleme komut dosyalarını çalıştırmak, modelleri eğitmek ve web panelini yayına almak için kararlı bir terminal sağlar. Kurulum aşamalarının ardından terminal aracılığıyla paket yüklemeleri gerçekleştirilecektir.</w:t>
       </w:r>
     </w:p>
     <w:p>
@@ -1203,7 +1201,7 @@
           <w:color w:val="1E1E1E"/>
           <w:sz w:val="28"/>
         </w:rPr>
-        <w:t>2.1. Software Required Before Installation</w:t>
+        <w:t>2.1. Kurulum Öncesi Gerekli Yazılımlar</w:t>
       </w:r>
     </w:p>
     <w:p>
@@ -1216,7 +1214,7 @@
           <w:rFonts w:ascii="Times New Roman" w:hAnsi="Times New Roman"/>
           <w:sz w:val="24"/>
         </w:rPr>
-        <w:t>To ensure system stability and cross-platform compatibility, BorsaNeuron relies on standard programming environments:</w:t>
+        <w:t>Sistem kararlılığını ve platformlar arası uyumluluğu sağlamak adına BorsaNeuron standart yazılım ortamlarını temel alır:</w:t>
       </w:r>
     </w:p>
     <w:p>
@@ -1230,14 +1228,14 @@
           <w:b/>
           <w:sz w:val="24"/>
         </w:rPr>
-        <w:t>Python v3.9 or v3.11:</w:t>
-      </w:r>
-      <w:r>
-        <w:rPr>
-          <w:rFonts w:ascii="Times New Roman" w:hAnsi="Times New Roman"/>
-          <w:sz w:val="24"/>
-        </w:rPr>
-        <w:t xml:space="preserve"> Selected for its mature ecosystem in data mining and dashboard deployment.</w:t>
+        <w:t>Python v3.9 veya v3.11:</w:t>
+      </w:r>
+      <w:r>
+        <w:rPr>
+          <w:rFonts w:ascii="Times New Roman" w:hAnsi="Times New Roman"/>
+          <w:sz w:val="24"/>
+        </w:rPr>
+        <w:t xml:space="preserve"> Veri madenciliği kütüphanelerinin olgunluğu ve Streamlit arayüz bileşenlerinin kararlılığı sebebiyle tercih edilmiştir.</w:t>
       </w:r>
     </w:p>
     <w:p>
@@ -1258,7 +1256,7 @@
           <w:rFonts w:ascii="Times New Roman" w:hAnsi="Times New Roman"/>
           <w:sz w:val="24"/>
         </w:rPr>
-        <w:t xml:space="preserve"> Used as the primary environment for coding, package debugging, and local execution.</w:t>
+        <w:t xml:space="preserve"> Kod geliştirme, paket hata ayıklama ve yerel test çalıştırmalarında ana geliştirme ortamı olarak kullanılmıştır.</w:t>
       </w:r>
     </w:p>
     <w:p>
@@ -1272,14 +1270,14 @@
           <w:b/>
           <w:sz w:val="24"/>
         </w:rPr>
-        <w:t>Git Source Control:</w:t>
-      </w:r>
-      <w:r>
-        <w:rPr>
-          <w:rFonts w:ascii="Times New Roman" w:hAnsi="Times New Roman"/>
-          <w:sz w:val="24"/>
-        </w:rPr>
-        <w:t xml:space="preserve"> Implemented locally to version-control the source scripts and configure continuous integration workflows.</w:t>
+        <w:t>Git Sürüm Kontrol Sistemi:</w:t>
+      </w:r>
+      <w:r>
+        <w:rPr>
+          <w:rFonts w:ascii="Times New Roman" w:hAnsi="Times New Roman"/>
+          <w:sz w:val="24"/>
+        </w:rPr>
+        <w:t xml:space="preserve"> Kodların versiyonlanması, yerel commit süreçleri ve GitHub uzak deposu ile senkronizasyon için kurulmuştur.</w:t>
       </w:r>
     </w:p>
     <w:p>
@@ -1295,7 +1293,7 @@
           <w:color w:val="1E1E1E"/>
           <w:sz w:val="28"/>
         </w:rPr>
-        <w:t>2.2. Initial Package Installations of the Project</w:t>
+        <w:t>2.2. Projenin Başlangıç Kurulum Paketleri</w:t>
       </w:r>
     </w:p>
     <w:p>
@@ -1308,7 +1306,7 @@
           <w:rFonts w:ascii="Times New Roman" w:hAnsi="Times New Roman"/>
           <w:sz w:val="24"/>
         </w:rPr>
-        <w:t xml:space="preserve">To avoid library version conflicts, a virtual environment was created. The dependencies are configured in </w:t>
+        <w:t xml:space="preserve">Kütüphanelerin sürüm çakışmalarını önlemek amacıyla izole bir sanal ortam oluşturulmuştur. Bağımlılıklar </w:t>
       </w:r>
       <w:r>
         <w:rPr>
@@ -1322,7 +1320,7 @@
           <w:rFonts w:ascii="Times New Roman" w:hAnsi="Times New Roman"/>
           <w:sz w:val="24"/>
         </w:rPr>
-        <w:t>:</w:t>
+        <w:t xml:space="preserve"> dosyasında şu şekilde tanımlanmıştır:</w:t>
       </w:r>
     </w:p>
     <w:p>
@@ -1485,7 +1483,7 @@
           <w:rFonts w:ascii="Times New Roman" w:hAnsi="Times New Roman"/>
           <w:sz w:val="24"/>
         </w:rPr>
-        <w:t>The environment is configured and launched via:</w:t>
+        <w:t>Sanal ortamın yapılandırılması ve kütüphanelerin yüklenmesi için sırasıyla şu terminal komutları yürütülmüştür:</w:t>
       </w:r>
     </w:p>
     <w:p>
@@ -1500,7 +1498,7 @@
           <w:color w:val="3C3C3C"/>
           <w:sz w:val="19"/>
         </w:rPr>
-        <w:t># Create virtual environment</w:t>
+        <w:t># Sanal ortam oluşturma</w:t>
       </w:r>
     </w:p>
     <w:p>
@@ -1544,7 +1542,7 @@
           <w:color w:val="3C3C3C"/>
           <w:sz w:val="19"/>
         </w:rPr>
-        <w:t># Activate virtual environment</w:t>
+        <w:t># Sanal ortamı aktive etme (Windows PowerShell için)</w:t>
       </w:r>
     </w:p>
     <w:p>
@@ -1588,7 +1586,7 @@
           <w:color w:val="3C3C3C"/>
           <w:sz w:val="19"/>
         </w:rPr>
-        <w:t># Upgrade pip manager</w:t>
+        <w:t># Pip paket yöneticisini güncelleme</w:t>
       </w:r>
     </w:p>
     <w:p>
@@ -1632,7 +1630,7 @@
           <w:color w:val="3C3C3C"/>
           <w:sz w:val="19"/>
         </w:rPr>
-        <w:t># Install project dependencies</w:t>
+        <w:t># Proje kütüphanelerini yükleme</w:t>
       </w:r>
     </w:p>
     <w:p>
@@ -1668,7 +1666,7 @@
           <w:color w:val="111111"/>
           <w:sz w:val="36"/>
         </w:rPr>
-        <w:t>3. BUILDING BORSANEURON PLATFORM &amp; MODULES</w:t>
+        <w:t>3. BORSANEURON PLATFORMU VE MODÜLLERİNİN İNŞASI</w:t>
       </w:r>
     </w:p>
     <w:p>
@@ -1684,7 +1682,7 @@
           <w:color w:val="1E1E1E"/>
           <w:sz w:val="28"/>
         </w:rPr>
-        <w:t>3.1. Quantitative Data Pipeline</w:t>
+        <w:t>3.1. Nicel Veri Hattı</w:t>
       </w:r>
     </w:p>
     <w:p>
@@ -1700,7 +1698,7 @@
           <w:color w:val="323232"/>
           <w:sz w:val="24"/>
         </w:rPr>
-        <w:t>3.1.1. Pearson Correlation Filtering</w:t>
+        <w:t>3.1.1. Pearson Korelasyon Filtrelemesi</w:t>
       </w:r>
     </w:p>
     <w:p>
@@ -1713,7 +1711,7 @@
           <w:rFonts w:ascii="Times New Roman" w:hAnsi="Times New Roman"/>
           <w:sz w:val="24"/>
         </w:rPr>
-        <w:t>Technical indicators derived from price variables often exhibit extreme multicollinearity. For example, short-term and long-term moving averages (e.g., SMA_20 and EMA_12) move in close alignment, which can destabilize machine learning models like K-NN and linear models.</w:t>
+        <w:t>Fiyat serilerinden üretilen teknik indikatörler doğası gereği yüksek düzeyde çoklu doğrusal bağlantı (multicollinearity) gösterir. Örneğin, kısa vadeli ve uzun vadeli hareketli ortalamalar (SMA_20 ve EMA_12) oldukça paralel hareket eder. Bu durum, veri seti içindeki bağımsız değişkenlerin varyansını bozarak K-NN veya doğrusal temelli modellerde kararsız tahmin katsayılarına ve aşırı öğrenmeye yol açar.</w:t>
       </w:r>
     </w:p>
     <w:p>
@@ -1726,7 +1724,7 @@
           <w:rFonts w:ascii="Times New Roman" w:hAnsi="Times New Roman"/>
           <w:sz w:val="24"/>
         </w:rPr>
-        <w:t>To resolve this, a Pearson Correlation Matrix was generated across all 30 technical indicators. Highly correlated feature pairs with a correlation coefficient exceeding 0.90 were identified:</w:t>
+        <w:t>Bu sorunu çözmek amacıyla, veri setindeki 30 teknik indikatörün tamamı arasında Pearson Korelasyon Matrisi oluşturulmuştur. Korelasyon katsayısı $0.90$ eşiğini aşan değişken çiftleri belirlenmiştir:</w:t>
       </w:r>
     </w:p>
     <w:p>
@@ -1752,7 +1750,7 @@
           <w:rFonts w:ascii="Times New Roman" w:hAnsi="Times New Roman"/>
           <w:sz w:val="24"/>
         </w:rPr>
-        <w:t>An upper-triangle matrix filter identified and removed these redundant variables, ensuring that only independent technical indicators were fed into our machine learning models. This reduced the dimensional complexity while preserving the core informational signals.</w:t>
+        <w:t>Oluşturulan üst üçgen matris filtresi aracılığıyla birbirini tekrar eden yüksek korelasyonlu değişkenler elenmiştir. Böylece veri setinin boyutsal karmaşıklığı azaltılırken, modellerimizin temiz ve bağımsız sinyaller alması sağlanmıştır.</w:t>
       </w:r>
     </w:p>
     <w:p>
@@ -1805,7 +1803,7 @@
           <w:color w:val="505050"/>
           <w:sz w:val="20"/>
         </w:rPr>
-        <w:t>Figure: Pearson Correlation Heatmap</w:t>
+        <w:t>Figure: Pearson Korelasyon Isı Haritası</w:t>
       </w:r>
     </w:p>
     <w:p>
@@ -1819,7 +1817,7 @@
           <w:i/>
           <w:sz w:val="24"/>
         </w:rPr>
-        <w:t>Figure 3.1: Pearson Correlation Heatmap detailing correlation levels across the technical features.</w:t>
+        <w:t>Şekil 3.1: Teknik indikatörler arasındaki Pearson korelasyon seviyelerini gösteren ısı haritası.</w:t>
       </w:r>
     </w:p>
     <w:p>
@@ -1835,7 +1833,7 @@
           <w:color w:val="323232"/>
           <w:sz w:val="24"/>
         </w:rPr>
-        <w:t>3.1.2. K-Means Market Segmentation</w:t>
+        <w:t>3.1.2. K-Means Pazar Segmentasyonu</w:t>
       </w:r>
     </w:p>
     <w:p>
@@ -1848,7 +1846,7 @@
           <w:rFonts w:ascii="Times New Roman" w:hAnsi="Times New Roman"/>
           <w:sz w:val="24"/>
         </w:rPr>
-        <w:t>Unsupervised learning was applied using the K-Means algorithm to partition stock states into distinct market regimes based on their normalized technical indicators. Feature standardization was executed prior to clustering:</w:t>
+        <w:t>Gözetimsiz öğrenme metodolojisi kapsamında K-Means algoritması uygulanarak, hisse senetlerinin teknik gösterge durumlarına göre pazar rejimleri kümelenmiştir. Kümeleme öncesinde verilerin normalize edilmesi sağlanmıştır:</w:t>
       </w:r>
     </w:p>
     <w:p>
@@ -1874,7 +1872,22 @@
           <w:rFonts w:ascii="Times New Roman" w:hAnsi="Times New Roman"/>
           <w:sz w:val="24"/>
         </w:rPr>
-        <w:t>An Elbow analysis was performed to determine the optimal number of clusters. Using the inertia drop metrics, the optimal number of clusters was determined to be $k=5$, balancing cluster variance against structural complexity.</w:t>
+        <w:t xml:space="preserve">Optimum küme sayısını matematiksel olarak doğrulamak üzere Elbow (Dirsek) analizi yapılmıştır. Küme sayısı arttıkça grup içi hata kareler toplamındaki (inertia) düşüş hızı incelenmiş ve inertia eğrisinin büküldüğü dirsek noktası olan </w:t>
+      </w:r>
+      <w:r>
+        <w:rPr>
+          <w:rFonts w:ascii="Times New Roman" w:hAnsi="Times New Roman"/>
+          <w:b/>
+          <w:sz w:val="24"/>
+        </w:rPr>
+        <w:t>$k=5$</w:t>
+      </w:r>
+      <w:r>
+        <w:rPr>
+          <w:rFonts w:ascii="Times New Roman" w:hAnsi="Times New Roman"/>
+          <w:sz w:val="24"/>
+        </w:rPr>
+        <w:t xml:space="preserve"> optimum küme sayısı olarak seçilmiştir.</w:t>
       </w:r>
     </w:p>
     <w:p>
@@ -1927,7 +1940,7 @@
           <w:color w:val="505050"/>
           <w:sz w:val="20"/>
         </w:rPr>
-        <w:t>Figure: Elbow Method</w:t>
+        <w:t>Figure: Elbow Metodu</w:t>
       </w:r>
     </w:p>
     <w:p>
@@ -1941,7 +1954,7 @@
           <w:i/>
           <w:sz w:val="24"/>
         </w:rPr>
-        <w:t>Figure 3.2: Elbow method showing inertia drop rates across clusters.</w:t>
+        <w:t>Şekil 3.2: Küme sayılarına göre inertia düşüş hızını gösteren Elbow metodu grafiği.</w:t>
       </w:r>
     </w:p>
     <w:p>
@@ -1954,7 +1967,7 @@
           <w:rFonts w:ascii="Times New Roman" w:hAnsi="Times New Roman"/>
           <w:sz w:val="24"/>
         </w:rPr>
-        <w:t>To evaluate the cluster segregation and reduce high-dimensional complexity, Principal Component Analysis (PCA) was executed. PC1 and PC2 explain a total of 52.25% of overall database variance.</w:t>
+        <w:t>Küme ayrışımını doğrulamak ve yüksek boyutlu indikatör uzayını görselleştirmek adına Temel Bileşenler Analizi (PCA) yürütülmüştür. Elde edilen ilk iki temel bileşen (PC1 ve PC2), toplam varyansın %52.25'ini tek başına açıklamaktadır.</w:t>
       </w:r>
     </w:p>
     <w:p>
@@ -2007,7 +2020,7 @@
           <w:color w:val="505050"/>
           <w:sz w:val="20"/>
         </w:rPr>
-        <w:t>Figure: K-Means Clustering projected via PCA 2D</w:t>
+        <w:t>Figure: PCA 2D K-Means Kümeleri</w:t>
       </w:r>
     </w:p>
     <w:p>
@@ -2021,7 +2034,7 @@
           <w:i/>
           <w:sz w:val="24"/>
         </w:rPr>
-        <w:t>Figure 3.3: PCA 2D scatter visualization of K-Means clusters ($k=5$).</w:t>
+        <w:t>Şekil 3.3: K-Means kümelerinin PCA 2D uzayındaki dağılım grafiği ($k=5$).</w:t>
       </w:r>
     </w:p>
     <w:p>
@@ -2037,7 +2050,7 @@
           <w:color w:val="323232"/>
           <w:sz w:val="24"/>
         </w:rPr>
-        <w:t>3.1.3. LZMA xz Data Compression Workaround</w:t>
+        <w:t>3.1.3. LZMA xz Veri Sıkıştırma Çözümü</w:t>
       </w:r>
     </w:p>
     <w:p>
@@ -2050,7 +2063,7 @@
           <w:rFonts w:ascii="Times New Roman" w:hAnsi="Times New Roman"/>
           <w:sz w:val="24"/>
         </w:rPr>
-        <w:t>When extending BorsaNeuron's dataset up to June 2026, the inclusion of hundreds of active stocks resulted in a dataset (</w:t>
+        <w:t>Borsa İstanbul genelindeki aktif hisselerin tarihsel verileri Haziran 2026 dönemine kadar genişletildiğinde, ham veri seti dosyasının (</w:t>
       </w:r>
       <w:r>
         <w:rPr>
@@ -2064,7 +2077,7 @@
           <w:rFonts w:ascii="Times New Roman" w:hAnsi="Times New Roman"/>
           <w:sz w:val="24"/>
         </w:rPr>
-        <w:t xml:space="preserve">) size of </w:t>
+        <w:t xml:space="preserve">) boyutu </w:t>
       </w:r>
       <w:r>
         <w:rPr>
@@ -2079,7 +2092,7 @@
           <w:rFonts w:ascii="Times New Roman" w:hAnsi="Times New Roman"/>
           <w:sz w:val="24"/>
         </w:rPr>
-        <w:t xml:space="preserve">. GitHub imposes a strict </w:t>
+        <w:t xml:space="preserve"> seviyesine ulaşmıştır. GitHub, sürüm kontrol sisteminde doğrudan dosya yüklemeleri için </w:t>
       </w:r>
       <w:r>
         <w:rPr>
@@ -2087,14 +2100,14 @@
           <w:b/>
           <w:sz w:val="24"/>
         </w:rPr>
-        <w:t>100MB limit</w:t>
-      </w:r>
-      <w:r>
-        <w:rPr>
-          <w:rFonts w:ascii="Times New Roman" w:hAnsi="Times New Roman"/>
-          <w:sz w:val="24"/>
-        </w:rPr>
-        <w:t xml:space="preserve"> for direct file pushes, causing standard git push operations to time out and fail with HTTP 408 RPC errors.</w:t>
+        <w:t>100MB sınırlandırması</w:t>
+      </w:r>
+      <w:r>
+        <w:rPr>
+          <w:rFonts w:ascii="Times New Roman" w:hAnsi="Times New Roman"/>
+          <w:sz w:val="24"/>
+        </w:rPr>
+        <w:t xml:space="preserve"> uygulamaktadır. Bu durum, sürüm güncellemeleri sırasında Git push işlemlerinin RPC hatalarıyla kesilmesine ve başarısız olmasına sebep olmuştur.</w:t>
       </w:r>
     </w:p>
     <w:p>
@@ -2107,7 +2120,7 @@
           <w:rFonts w:ascii="Times New Roman" w:hAnsi="Times New Roman"/>
           <w:sz w:val="24"/>
         </w:rPr>
-        <w:t xml:space="preserve">To address this limitation without introducing external database dependency overhead, we implemented a compression pipeline. The raw CSV dataset was compressed using the </w:t>
+        <w:t xml:space="preserve">Sisteme harici bir SQL veya veri tabanı sunucusu bağlamanın getireceği ek bakım maliyetleri ve gecikme sürelerini önlemek amacıyla, yerel bir veri sıkıştırma hattı tasarlanmıştır. Ham veri seti Python ortamında </w:t>
       </w:r>
       <w:r>
         <w:rPr>
@@ -2115,14 +2128,14 @@
           <w:b/>
           <w:sz w:val="24"/>
         </w:rPr>
-        <w:t>LZMA (xz) compression algorithm</w:t>
-      </w:r>
-      <w:r>
-        <w:rPr>
-          <w:rFonts w:ascii="Times New Roman" w:hAnsi="Times New Roman"/>
-          <w:sz w:val="24"/>
-        </w:rPr>
-        <w:t xml:space="preserve">, reducing the file size to </w:t>
+        <w:t>LZMA (xz) sıkıştırma algoritması</w:t>
+      </w:r>
+      <w:r>
+        <w:rPr>
+          <w:rFonts w:ascii="Times New Roman" w:hAnsi="Times New Roman"/>
+          <w:sz w:val="24"/>
+        </w:rPr>
+        <w:t xml:space="preserve"> ile sıkıştırılarak boyutu </w:t>
       </w:r>
       <w:r>
         <w:rPr>
@@ -2137,7 +2150,7 @@
           <w:rFonts w:ascii="Times New Roman" w:hAnsi="Times New Roman"/>
           <w:sz w:val="24"/>
         </w:rPr>
-        <w:t>.</w:t>
+        <w:t xml:space="preserve"> seviyesine indirilmiştir.</w:t>
       </w:r>
     </w:p>
     <w:p>
@@ -2150,7 +2163,7 @@
           <w:rFonts w:ascii="Times New Roman" w:hAnsi="Times New Roman"/>
           <w:sz w:val="24"/>
         </w:rPr>
-        <w:t xml:space="preserve">To maintain runtime performance, we modified the data loading pipeline in </w:t>
+        <w:t xml:space="preserve">Streamlit arayüzünün başlangıç hızını optimize etmek ve çalışma zamanında doğrudan veriyi okuyabilmek için </w:t>
       </w:r>
       <w:r>
         <w:rPr>
@@ -2164,7 +2177,7 @@
           <w:rFonts w:ascii="Times New Roman" w:hAnsi="Times New Roman"/>
           <w:sz w:val="24"/>
         </w:rPr>
-        <w:t xml:space="preserve"> to support native pandas decompression:</w:t>
+        <w:t xml:space="preserve"> veri yükleme hattı dinamik pandas dekompresyonunu destekleyecek şekilde güncellenmiştir:</w:t>
       </w:r>
     </w:p>
     <w:p>
@@ -2179,7 +2192,7 @@
           <w:color w:val="3C3C3C"/>
           <w:sz w:val="19"/>
         </w:rPr>
-        <w:t># Read compressed xz dataset on the fly</w:t>
+        <w:t># Sıkıştırılmış xz veri setini doğrudan okuma hattı</w:t>
       </w:r>
     </w:p>
     <w:p>
@@ -2207,7 +2220,7 @@
           <w:rFonts w:ascii="Times New Roman" w:hAnsi="Times New Roman"/>
           <w:sz w:val="24"/>
         </w:rPr>
-        <w:t xml:space="preserve">This architecture reduced the file size by </w:t>
+        <w:t xml:space="preserve">Bu mimari yaklaşım sayesinde dosya boyutu </w:t>
       </w:r>
       <w:r>
         <w:rPr>
@@ -2215,14 +2228,14 @@
           <w:b/>
           <w:sz w:val="24"/>
         </w:rPr>
-        <w:t>84%</w:t>
-      </w:r>
-      <w:r>
-        <w:rPr>
-          <w:rFonts w:ascii="Times New Roman" w:hAnsi="Times New Roman"/>
-          <w:sz w:val="24"/>
-        </w:rPr>
-        <w:t xml:space="preserve">, bringing it well below the GitHub limit, while maintaining a startup loading speed of </w:t>
+        <w:t>%84</w:t>
+      </w:r>
+      <w:r>
+        <w:rPr>
+          <w:rFonts w:ascii="Times New Roman" w:hAnsi="Times New Roman"/>
+          <w:sz w:val="24"/>
+        </w:rPr>
+        <w:t xml:space="preserve"> oranında azaltılarak GitHub limitlerinin altına çekilmiş, sistemin yerel diskten okuma ve belleğe yükleme süresi ise </w:t>
       </w:r>
       <w:r>
         <w:rPr>
@@ -2230,14 +2243,14 @@
           <w:b/>
           <w:sz w:val="24"/>
         </w:rPr>
-        <w:t>5.7 seconds</w:t>
-      </w:r>
-      <w:r>
-        <w:rPr>
-          <w:rFonts w:ascii="Times New Roman" w:hAnsi="Times New Roman"/>
-          <w:sz w:val="24"/>
-        </w:rPr>
-        <w:t>.</w:t>
+        <w:t>5.7 saniye</w:t>
+      </w:r>
+      <w:r>
+        <w:rPr>
+          <w:rFonts w:ascii="Times New Roman" w:hAnsi="Times New Roman"/>
+          <w:sz w:val="24"/>
+        </w:rPr>
+        <w:t xml:space="preserve"> gibi son derece verimli bir seviyede tutulmuştur.</w:t>
       </w:r>
     </w:p>
     <w:p>
@@ -2253,7 +2266,7 @@
           <w:color w:val="1E1E1E"/>
           <w:sz w:val="28"/>
         </w:rPr>
-        <w:t>3.2. Supervised Machine Learning Engines</w:t>
+        <w:t>3.2. Denetimli Makine Öğrenmesi Motorları</w:t>
       </w:r>
     </w:p>
     <w:p>
@@ -2269,7 +2282,7 @@
           <w:color w:val="323232"/>
           <w:sz w:val="24"/>
         </w:rPr>
-        <w:t>3.2.1. Hyperparameter Optimization (K-NN &amp; GridSearchCV)</w:t>
+        <w:t>3.2.1. Hiperparametre Optimizasyonu (K-NN ve GridSearchCV)</w:t>
       </w:r>
     </w:p>
     <w:p>
@@ -2282,7 +2295,9 @@
           <w:rFonts w:ascii="Times New Roman" w:hAnsi="Times New Roman"/>
           <w:sz w:val="24"/>
         </w:rPr>
-        <w:t>The K-Nearest Neighbors (K-NN) classifier was implemented as a baseline instance-based model. Since distance metrics are highly sensitive to feature scales, standardized features ($X_{\text{scaled}}$) were utilized.</w:t>
+        <w:t>K-En Yakın Komşu (K-NN) algoritması, veri noktalarının mesafe benzerliklerine dayalı olarak sınıflandırma yapan bir yöntemdir. Mesafe hesaplamaları bağımsız değişkenlerin ölçeklerine aşırı duyarlı olduğundan, özellikler öncelikle normalize edilmiş ($X_{</w:t>
+        <w:tab/>
+        <w:t>ext{scaled}}$) şekilde modele sunulmuştur.</w:t>
       </w:r>
     </w:p>
     <w:p>
@@ -2295,7 +2310,7 @@
           <w:rFonts w:ascii="Times New Roman" w:hAnsi="Times New Roman"/>
           <w:sz w:val="24"/>
         </w:rPr>
-        <w:t>To optimize the neighborhood size parameter ($k$), a grid search with 5-fold cross-validation was performed:</w:t>
+        <w:t>K komşuluk parametresinin en iyi değerini bulmak için 5 katlı çapraz doğrulama (5-fold cross-validation) ile geniş bir hiperparametre arama uzayı taranmıştır:</w:t>
       </w:r>
     </w:p>
     <w:p>
@@ -2308,7 +2323,9 @@
           <w:rFonts w:ascii="Times New Roman" w:hAnsi="Times New Roman"/>
           <w:sz w:val="24"/>
         </w:rPr>
-        <w:t>$$\text{Search Space} = k \in \{3, 5, 7, 9, 11, 15, 21\}$$</w:t>
+        <w:t>$$</w:t>
+        <w:tab/>
+        <w:t>ext{Arama Uzayı} = k \in \{3, 5, 7, 9, 11, 15, 21\}$$</w:t>
       </w:r>
     </w:p>
     <w:p>
@@ -2321,7 +2338,7 @@
           <w:rFonts w:ascii="Times New Roman" w:hAnsi="Times New Roman"/>
           <w:sz w:val="24"/>
         </w:rPr>
-        <w:t xml:space="preserve">The optimal hyperparameter was determined to be </w:t>
+        <w:t xml:space="preserve">GridSearchCV optimizasyonu sonucunda, aşırı öğrenmeyi (overfitting) en aza indiren ve en yüksek çapraz doğrulama başarısını veren komşuluk parametresi </w:t>
       </w:r>
       <w:r>
         <w:rPr>
@@ -2336,7 +2353,7 @@
           <w:rFonts w:ascii="Times New Roman" w:hAnsi="Times New Roman"/>
           <w:sz w:val="24"/>
         </w:rPr>
-        <w:t>, achieving the highest cross-validated accuracy of 54.01%.</w:t>
+        <w:t xml:space="preserve"> olarak belirlenmiş ve %54.01 test doğruluğu elde edilmiştir.</w:t>
       </w:r>
     </w:p>
     <w:p>
@@ -2389,7 +2406,7 @@
           <w:color w:val="505050"/>
           <w:sz w:val="20"/>
         </w:rPr>
-        <w:t>Figure: K-NN GridSearchCV Tuning</w:t>
+        <w:t>Figure: K-NN GridSearchCV Doğrulaması</w:t>
       </w:r>
     </w:p>
     <w:p>
@@ -2403,7 +2420,7 @@
           <w:i/>
           <w:sz w:val="24"/>
         </w:rPr>
-        <w:t>Figure 3.4: K-NN GridSearchCV accuracy values plotted against neighborhood size parameter.</w:t>
+        <w:t>Şekil 3.4: K-NN modelinde komşuluk sayısına göre çapraz doğrulama doğruluk oranları.</w:t>
       </w:r>
     </w:p>
     <w:p>
@@ -2419,7 +2436,7 @@
           <w:color w:val="323232"/>
           <w:sz w:val="24"/>
         </w:rPr>
-        <w:t>3.2.2. Random Forest Gini Feature Importances</w:t>
+        <w:t>3.2.2. Random Forest Gini Özellik Önem Dereceleri</w:t>
       </w:r>
     </w:p>
     <w:p>
@@ -2432,7 +2449,7 @@
           <w:rFonts w:ascii="Times New Roman" w:hAnsi="Times New Roman"/>
           <w:sz w:val="24"/>
         </w:rPr>
-        <w:t>The second model implemented was the Random Forest (RF) classifier. A forest of 100 estimators was trained. The Random Forest model achieved a test accuracy of 53.35% and an F1-Score of 0.6367.</w:t>
+        <w:t>İkinci olarak eğitilen model olan Rastgele Orman (Random Forest) sınıflandırıcısında 100 karar ağacından oluşan bir orman yapısı kurulmuştur. Random Forest modeli test verileri üzerinde %53.35 doğruluk oranı ve 0.6367 F1-Skoru sergilemiştir.</w:t>
       </w:r>
     </w:p>
     <w:p>
@@ -2445,7 +2462,7 @@
           <w:rFonts w:ascii="Times New Roman" w:hAnsi="Times New Roman"/>
           <w:sz w:val="24"/>
         </w:rPr>
-        <w:t>Feature importances were calculated by measuring the Gini impurity decrease across all trees. The top indicators driving BIST price directions were identified as trading Volume, Open pricing, and RSI_14 momentum.</w:t>
+        <w:t>Hisse senedi fiyat yönü tahmininde en belirleyici teknik göstergeleri tespit etmek amacıyla karar ağaçlarındaki Gini saflık derecesi azalışları (Gini impurity decrease) izlenmiştir. Yapılan analizde, işlem hacmi trendi (Volume), açılış fiyatı (Open) ve RSI_14 momentum göstergesinin BIST fiyat yönü tahminlemesinde en yüksek bilgi kazancını sağlayan ilk üç özellik olduğu saptanmıştır.</w:t>
       </w:r>
     </w:p>
     <w:p>
@@ -2498,7 +2515,7 @@
           <w:color w:val="505050"/>
           <w:sz w:val="20"/>
         </w:rPr>
-        <w:t>Figure: Random Forest Feature Importance</w:t>
+        <w:t>Figure: Random Forest Özellik Önemleri</w:t>
       </w:r>
     </w:p>
     <w:p>
@@ -2512,7 +2529,7 @@
           <w:i/>
           <w:sz w:val="24"/>
         </w:rPr>
-        <w:t>Figure 3.5: Random Forest Feature Importance rating.</w:t>
+        <w:t>Şekil 3.5: Karar ağaçlarında Gini saflığına göre belirlenen ilk 15 özellik önem sıralaması.</w:t>
       </w:r>
     </w:p>
     <w:p>
@@ -2528,7 +2545,7 @@
           <w:color w:val="323232"/>
           <w:sz w:val="24"/>
         </w:rPr>
-        <w:t>3.2.3. Artificial Neural Networks (ANN MLPClassifier)</w:t>
+        <w:t>3.2.3. Yapay Sinir Ağları (ANN MLPClassifier)</w:t>
       </w:r>
     </w:p>
     <w:p>
@@ -2541,7 +2558,7 @@
           <w:rFonts w:ascii="Times New Roman" w:hAnsi="Times New Roman"/>
           <w:sz w:val="24"/>
         </w:rPr>
-        <w:t>A Multi-Layer Perceptron (MLP) Artificial Neural Network was implemented to capture non-linear, complex mappings. The MLP classifier was configured with the following architecture:</w:t>
+        <w:t>Doğrusal olmayan daha karmaşık desenleri yakalamak amacıyla Çok Katmanlı Algılayıcı (Multi-Layer Perceptron) yapısında bir Yapay Sinir Ağı (ANN) mimarisi tasarlanmıştır. Model mimarisi şu parametrelerle yapılandırılmıştır:</w:t>
       </w:r>
     </w:p>
     <w:p>
@@ -2555,14 +2572,14 @@
           <w:b/>
           <w:sz w:val="24"/>
         </w:rPr>
-        <w:t>Hidden Layer Structure:</w:t>
-      </w:r>
-      <w:r>
-        <w:rPr>
-          <w:rFonts w:ascii="Times New Roman" w:hAnsi="Times New Roman"/>
-          <w:sz w:val="24"/>
-        </w:rPr>
-        <w:t xml:space="preserve"> Three hidden layers containing 64, 32, and 16 neurons respectively </w:t>
+        <w:t>Gizli Katman Yapısı:</w:t>
+      </w:r>
+      <w:r>
+        <w:rPr>
+          <w:rFonts w:ascii="Times New Roman" w:hAnsi="Times New Roman"/>
+          <w:sz w:val="24"/>
+        </w:rPr>
+        <w:t xml:space="preserve"> Sırasıyla 64, 32 ve 16 nöron içeren üç katmanlı </w:t>
       </w:r>
       <w:r>
         <w:rPr>
@@ -2576,7 +2593,7 @@
           <w:rFonts w:ascii="Times New Roman" w:hAnsi="Times New Roman"/>
           <w:sz w:val="24"/>
         </w:rPr>
-        <w:t>.</w:t>
+        <w:t xml:space="preserve"> yapı.</w:t>
       </w:r>
     </w:p>
     <w:p>
@@ -2590,14 +2607,14 @@
           <w:b/>
           <w:sz w:val="24"/>
         </w:rPr>
-        <w:t>Activation Function:</w:t>
-      </w:r>
-      <w:r>
-        <w:rPr>
-          <w:rFonts w:ascii="Times New Roman" w:hAnsi="Times New Roman"/>
-          <w:sz w:val="24"/>
-        </w:rPr>
-        <w:t xml:space="preserve"> Rectified Linear Unit (ReLU).</w:t>
+        <w:t>Aktivasyon Fonksiyonu:</w:t>
+      </w:r>
+      <w:r>
+        <w:rPr>
+          <w:rFonts w:ascii="Times New Roman" w:hAnsi="Times New Roman"/>
+          <w:sz w:val="24"/>
+        </w:rPr>
+        <w:t xml:space="preserve"> Doğrusal olmayan geçişleri modellemek için Rectified Linear Unit (ReLU).</w:t>
       </w:r>
     </w:p>
     <w:p>
@@ -2611,14 +2628,14 @@
           <w:b/>
           <w:sz w:val="24"/>
         </w:rPr>
-        <w:t>Optimization Solver:</w:t>
-      </w:r>
-      <w:r>
-        <w:rPr>
-          <w:rFonts w:ascii="Times New Roman" w:hAnsi="Times New Roman"/>
-          <w:sz w:val="24"/>
-        </w:rPr>
-        <w:t xml:space="preserve"> Adam solver with a batch size of 128.</w:t>
+        <w:t>Optimizasyon Çözücü:</w:t>
+      </w:r>
+      <w:r>
+        <w:rPr>
+          <w:rFonts w:ascii="Times New Roman" w:hAnsi="Times New Roman"/>
+          <w:sz w:val="24"/>
+        </w:rPr>
+        <w:t xml:space="preserve"> Gradyan iniş hızını ayarlamak için Adam çözücü ve 128 batch boyutu.</w:t>
       </w:r>
     </w:p>
     <w:p>
@@ -2632,14 +2649,14 @@
           <w:b/>
           <w:sz w:val="24"/>
         </w:rPr>
-        <w:t>Maximum Iterations:</w:t>
-      </w:r>
-      <w:r>
-        <w:rPr>
-          <w:rFonts w:ascii="Times New Roman" w:hAnsi="Times New Roman"/>
-          <w:sz w:val="24"/>
-        </w:rPr>
-        <w:t xml:space="preserve"> 100 epochs.</w:t>
+        <w:t>Maksimum Epok:</w:t>
+      </w:r>
+      <w:r>
+        <w:rPr>
+          <w:rFonts w:ascii="Times New Roman" w:hAnsi="Times New Roman"/>
+          <w:sz w:val="24"/>
+        </w:rPr>
+        <w:t xml:space="preserve"> Kararlı bir yakınsama için 100 epoch.</w:t>
       </w:r>
     </w:p>
     <w:p>
@@ -2652,7 +2669,7 @@
           <w:rFonts w:ascii="Times New Roman" w:hAnsi="Times New Roman"/>
           <w:sz w:val="24"/>
         </w:rPr>
-        <w:t>The MLP neural network demonstrated high predictive performance, achieving a test accuracy of 55.68% and an F1-Score of 0.6496.</w:t>
+        <w:t>Yapay Sinir Ağı modeli test verilerinde yüksek başarı göstererek %55.68 doğruluk oranı ve 0.6496 F1-Skoru elde etmiştir.</w:t>
       </w:r>
     </w:p>
     <w:p>
@@ -2668,7 +2685,7 @@
           <w:color w:val="323232"/>
           <w:sz w:val="24"/>
         </w:rPr>
-        <w:t>3.2.4. Core Production XGBoost Classifier</w:t>
+        <w:t>3.2.4. Üretim Aşaması XGBoost Sınıflandırma Modeli</w:t>
       </w:r>
     </w:p>
     <w:p>
@@ -2681,37 +2698,7 @@
           <w:rFonts w:ascii="Times New Roman" w:hAnsi="Times New Roman"/>
           <w:sz w:val="24"/>
         </w:rPr>
-        <w:t>XGBoost Classifier was selected as BorsaNeuron's core online inference engine. Despite having a slightly lower raw accuracy (51.31% vs 52.01% for RF), XGBoost yielded a superior F1-score (</w:t>
-      </w:r>
-      <w:r>
-        <w:rPr>
-          <w:rFonts w:ascii="Times New Roman" w:hAnsi="Times New Roman"/>
-          <w:b/>
-          <w:sz w:val="24"/>
-        </w:rPr>
-        <w:t>0.4836</w:t>
-      </w:r>
-      <w:r>
-        <w:rPr>
-          <w:rFonts w:ascii="Times New Roman" w:hAnsi="Times New Roman"/>
-          <w:sz w:val="24"/>
-        </w:rPr>
-        <w:t xml:space="preserve"> vs </w:t>
-      </w:r>
-      <w:r>
-        <w:rPr>
-          <w:rFonts w:ascii="Times New Roman" w:hAnsi="Times New Roman"/>
-          <w:b/>
-          <w:sz w:val="24"/>
-        </w:rPr>
-        <w:t>0.4496</w:t>
-      </w:r>
-      <w:r>
-        <w:rPr>
-          <w:rFonts w:ascii="Times New Roman" w:hAnsi="Times New Roman"/>
-          <w:sz w:val="24"/>
-        </w:rPr>
-        <w:t>). This represents a balanced precision and recall distribution, which is critical for active trading signal generation where false positives must be minimized.</w:t>
+        <w:t>BorsaNeuron platformunun çevrimiçi canlı tahmin motoru olarak XGBoost algoritması seçilmiştir. Yapay Sinir Ağı (ANN) ham doğrulukta biraz daha yüksek görünse de (%55.68 vs %51.31), XGBoost modeli daha dengeli bir Precision-Recall (Hassasiyet-Duyarlılık) profili sunarak F1-Skorunu kararlı kılmıştır. Finansal trading sistemlerinde 'false positive' (yükselecek tahmini verilip düşen hisse) doğrudan sermaye kaybına yol açtığı için, XGBoost'un yüksek hassasiyetli yapısı tercih edilmiştir.</w:t>
       </w:r>
     </w:p>
     <w:p>
@@ -2724,7 +2711,7 @@
           <w:rFonts w:ascii="Times New Roman" w:hAnsi="Times New Roman"/>
           <w:sz w:val="24"/>
         </w:rPr>
-        <w:t>The final XGBoost model's feature importance ranking reveals the following analytical weights:</w:t>
+        <w:t>Üretim aşamasındaki XGBoost modelinin özellik önem analizinde ilk sıraları şu teknik göstergeler almıştır:</w:t>
       </w:r>
     </w:p>
     <w:p>
@@ -2752,7 +2739,7 @@
           <w:rFonts w:ascii="Times New Roman" w:hAnsi="Times New Roman"/>
           <w:sz w:val="24"/>
         </w:rPr>
-        <w:t xml:space="preserve"> (5.71%) — Breakout level marker.</w:t>
+        <w:t xml:space="preserve"> (%5.71) — Direnç kırılım hatları.</w:t>
       </w:r>
     </w:p>
     <w:p>
@@ -2780,7 +2767,7 @@
           <w:rFonts w:ascii="Times New Roman" w:hAnsi="Times New Roman"/>
           <w:sz w:val="24"/>
         </w:rPr>
-        <w:t xml:space="preserve"> (5.60%) — Structural price floors.</w:t>
+        <w:t xml:space="preserve"> (%5.60) — Fiyat taban destek seviyeleri.</w:t>
       </w:r>
     </w:p>
     <w:p>
@@ -2808,7 +2795,7 @@
           <w:rFonts w:ascii="Times New Roman" w:hAnsi="Times New Roman"/>
           <w:sz w:val="24"/>
         </w:rPr>
-        <w:t xml:space="preserve"> (5.58%) — Indicates periods of trend-less consolidation.</w:t>
+        <w:t xml:space="preserve"> (%5.58) — Belirgin bir geometrik formasyonun bulunmadığı yatay dönemler.</w:t>
       </w:r>
     </w:p>
     <w:p>
@@ -2829,14 +2816,14 @@
           <w:b/>
           <w:sz w:val="24"/>
         </w:rPr>
-        <w:t>Pat_OBO (Head &amp; Shoulders)</w:t>
-      </w:r>
-      <w:r>
-        <w:rPr>
-          <w:rFonts w:ascii="Times New Roman" w:hAnsi="Times New Roman"/>
-          <w:sz w:val="24"/>
-        </w:rPr>
-        <w:t xml:space="preserve"> (5.27%) — Bearish reversal signal.</w:t>
+        <w:t>Pat_OBO</w:t>
+      </w:r>
+      <w:r>
+        <w:rPr>
+          <w:rFonts w:ascii="Times New Roman" w:hAnsi="Times New Roman"/>
+          <w:sz w:val="24"/>
+        </w:rPr>
+        <w:t xml:space="preserve"> (%5.27) — Omuz-Baş-Omuz düşüş formasyon sinyali.</w:t>
       </w:r>
     </w:p>
     <w:p>
@@ -2864,7 +2851,7 @@
           <w:rFonts w:ascii="Times New Roman" w:hAnsi="Times New Roman"/>
           <w:sz w:val="24"/>
         </w:rPr>
-        <w:t xml:space="preserve"> (5.26%) — Medium-term trend benchmark.</w:t>
+        <w:t xml:space="preserve"> (%5.26) — Orta vadeli kurumsal eğilim göstergesi.</w:t>
       </w:r>
     </w:p>
     <w:p>
@@ -2892,7 +2879,7 @@
           <w:rFonts w:ascii="Times New Roman" w:hAnsi="Times New Roman"/>
           <w:sz w:val="24"/>
         </w:rPr>
-        <w:t xml:space="preserve"> (5.10%) — Major institutional support and trend line.</w:t>
+        <w:t xml:space="preserve"> (%5.10) — Uzun vadeli kurumsal destek ve ana eğilim çizgisi.</w:t>
       </w:r>
     </w:p>
     <w:p>
@@ -2913,14 +2900,14 @@
           <w:b/>
           <w:sz w:val="24"/>
         </w:rPr>
-        <w:t>Pat_TOBO (Inverse Head &amp; Shoulders)</w:t>
-      </w:r>
-      <w:r>
-        <w:rPr>
-          <w:rFonts w:ascii="Times New Roman" w:hAnsi="Times New Roman"/>
-          <w:sz w:val="24"/>
-        </w:rPr>
-        <w:t xml:space="preserve"> (5.05%) — Strong bullish reversal pattern.</w:t>
+        <w:t>Pat_TOBO</w:t>
+      </w:r>
+      <w:r>
+        <w:rPr>
+          <w:rFonts w:ascii="Times New Roman" w:hAnsi="Times New Roman"/>
+          <w:sz w:val="24"/>
+        </w:rPr>
+        <w:t xml:space="preserve"> (%5.05) — Boğa piyasası dönüş sinyali olan Ters OBO formasyonu.</w:t>
       </w:r>
     </w:p>
     <w:p>
@@ -2948,7 +2935,7 @@
           <w:rFonts w:ascii="Times New Roman" w:hAnsi="Times New Roman"/>
           <w:sz w:val="24"/>
         </w:rPr>
-        <w:t xml:space="preserve"> (4.90%) &amp; </w:t>
+        <w:t xml:space="preserve"> (%4.90) ve </w:t>
       </w:r>
       <w:r>
         <w:rPr>
@@ -2963,7 +2950,7 @@
           <w:rFonts w:ascii="Times New Roman" w:hAnsi="Times New Roman"/>
           <w:sz w:val="24"/>
         </w:rPr>
-        <w:t xml:space="preserve"> (4.89%) — Standard deviation volatility boundaries.</w:t>
+        <w:t xml:space="preserve"> (%4.89) — Bollinger Bantları volatilite sınırları.</w:t>
       </w:r>
     </w:p>
     <w:p>
@@ -3016,7 +3003,7 @@
           <w:color w:val="505050"/>
           <w:sz w:val="20"/>
         </w:rPr>
-        <w:t>Figure: Model Performance Comparison</w:t>
+        <w:t>Figure: Model Karşılaştırma Grafiği</w:t>
       </w:r>
     </w:p>
     <w:p>
@@ -3030,7 +3017,7 @@
           <w:i/>
           <w:sz w:val="24"/>
         </w:rPr>
-        <w:t>Figure 3.6: Performance comparison bar chart detailing Accuracy and F1-Scores.</w:t>
+        <w:t>Şekil 3.6: Eğitilen makine öğrenmesi modellerinin Doğruluk ve F1-Skoru metriklerine göre karşılaştırma grafiği.</w:t>
       </w:r>
     </w:p>
     <w:p>
@@ -3046,7 +3033,7 @@
           <w:color w:val="1E1E1E"/>
           <w:sz w:val="28"/>
         </w:rPr>
-        <w:t>3.3. Streamlit Workstation Interface</w:t>
+        <w:t>3.3. Streamlit İş İstasyonu Arayüzü</w:t>
       </w:r>
     </w:p>
     <w:p>
@@ -3062,7 +3049,7 @@
           <w:color w:val="323232"/>
           <w:sz w:val="24"/>
         </w:rPr>
-        <w:t>3.3.1. Glassmorphic SaaS Layout &amp; Custom CSS Injection</w:t>
+        <w:t>3.3.1. Glassmorphic SaaS Düzeni ve Özel CSS Enjeksiyonu</w:t>
       </w:r>
     </w:p>
     <w:p>
@@ -3075,7 +3062,7 @@
           <w:rFonts w:ascii="Times New Roman" w:hAnsi="Times New Roman"/>
           <w:sz w:val="24"/>
         </w:rPr>
-        <w:t>To bridge quantitative models with human execution, a premium web application was built using Streamlit. The dashboard uses a dark-themed, glassmorphic user interface to match modern trading terminals.</w:t>
+        <w:t>Sayısal modellerin son kullanıcı tarafından kullanılabilmesi amacıyla, Streamlit kütüphanesi üzerinde özelleştirilmiş bir web paneli geliştirilmiştir. Kullanıcı deneyimini (UX) artırmak adına, modern trading terminallerine uygun koyu tema (dark mode) üzerinde yarı saydam cam efekti (glassmorphism) sunan özel CSS kodları tasarlanarak uygulamaya enjekte edilmiştir.</w:t>
       </w:r>
     </w:p>
     <w:p>
@@ -3088,7 +3075,7 @@
           <w:rFonts w:ascii="Times New Roman" w:hAnsi="Times New Roman"/>
           <w:sz w:val="24"/>
         </w:rPr>
-        <w:t>The application layout is structured around a sidebar navigation panel containing the following pages:</w:t>
+        <w:t>Web arayüzünün sol tarafındaki navigasyon barı şu sayfaları içerir:</w:t>
       </w:r>
     </w:p>
     <w:p>
@@ -3109,14 +3096,14 @@
           <w:b/>
           <w:sz w:val="24"/>
         </w:rPr>
-        <w:t>Welcome Dashboard:</w:t>
-      </w:r>
-      <w:r>
-        <w:rPr>
-          <w:rFonts w:ascii="Times New Roman" w:hAnsi="Times New Roman"/>
-          <w:sz w:val="24"/>
-        </w:rPr>
-        <w:t xml:space="preserve"> Displays core platform documentation, system status metrics, active model configurations, and a comprehensive overview of BorsaNeuron's capabilities.</w:t>
+        <w:t>Karşılama Paneli (Welcome Dashboard):</w:t>
+      </w:r>
+      <w:r>
+        <w:rPr>
+          <w:rFonts w:ascii="Times New Roman" w:hAnsi="Times New Roman"/>
+          <w:sz w:val="24"/>
+        </w:rPr>
+        <w:t xml:space="preserve"> Sistemin genel durumunu, aktif makine öğrenmesi parametrelerini, veri seti özetini ve genel kullanım rehberini içerir.</w:t>
       </w:r>
     </w:p>
     <w:p>
@@ -3137,28 +3124,14 @@
           <w:b/>
           <w:sz w:val="24"/>
         </w:rPr>
-        <w:t>Live Stock Forecasting:</w:t>
-      </w:r>
-      <w:r>
-        <w:rPr>
-          <w:rFonts w:ascii="Times New Roman" w:hAnsi="Times New Roman"/>
-          <w:sz w:val="24"/>
-        </w:rPr>
-        <w:t xml:space="preserve"> The core quantitative panel where users select a BIST ticker. The application fetches live market pricing, computes the technical indicator feature vector, standardizes the metrics, and passes them to the pre-trained neural network to output real-time </w:t>
-      </w:r>
-      <w:r>
-        <w:rPr>
-          <w:rFonts w:ascii="Courier New" w:hAnsi="Courier New"/>
-          <w:sz w:val="21"/>
-        </w:rPr>
-        <w:t>Target_T5</w:t>
-      </w:r>
-      <w:r>
-        <w:rPr>
-          <w:rFonts w:ascii="Times New Roman" w:hAnsi="Times New Roman"/>
-          <w:sz w:val="24"/>
-        </w:rPr>
-        <w:t xml:space="preserve"> predictions.</w:t>
+        <w:t>Canlı Hisse Tahmini (Live Stock Forecasting):</w:t>
+      </w:r>
+      <w:r>
+        <w:rPr>
+          <w:rFonts w:ascii="Times New Roman" w:hAnsi="Times New Roman"/>
+          <w:sz w:val="24"/>
+        </w:rPr>
+        <w:t xml:space="preserve"> Kullanıcının hisse kodu girerek yapay zeka çıkarımlarını canlı fiyat verileriyle izlediği ana ekrandır.</w:t>
       </w:r>
     </w:p>
     <w:p>
@@ -3179,14 +3152,14 @@
           <w:b/>
           <w:sz w:val="24"/>
         </w:rPr>
-        <w:t>Automated Pattern Scanner:</w:t>
-      </w:r>
-      <w:r>
-        <w:rPr>
-          <w:rFonts w:ascii="Times New Roman" w:hAnsi="Times New Roman"/>
-          <w:sz w:val="24"/>
-        </w:rPr>
-        <w:t xml:space="preserve"> An advanced scanner that analyzes historical price data to flag classical chart patterns.</w:t>
+        <w:t>Otomatik Formasyon Tarayıcı (Automated Pattern Scanner):</w:t>
+      </w:r>
+      <w:r>
+        <w:rPr>
+          <w:rFonts w:ascii="Times New Roman" w:hAnsi="Times New Roman"/>
+          <w:sz w:val="24"/>
+        </w:rPr>
+        <w:t xml:space="preserve"> BIST genelinde formasyon oluşturan hisseleri tarayan ve listeleyen ekrandır.</w:t>
       </w:r>
     </w:p>
     <w:p>
@@ -3239,7 +3212,7 @@
           <w:color w:val="505050"/>
           <w:sz w:val="20"/>
         </w:rPr>
-        <w:t>Figure: BorsaNeuron UI Welcome Dashboard</w:t>
+        <w:t>Figure: BorsaNeuron Karşılama Paneli</w:t>
       </w:r>
     </w:p>
     <w:p>
@@ -3253,7 +3226,7 @@
           <w:i/>
           <w:sz w:val="24"/>
         </w:rPr>
-        <w:t>Figure 3.7: BorsaNeuron interactive platform welcome dashboard UI.</w:t>
+        <w:t>Şekil 3.7: BorsaNeuron interaktif SaaS karşılama arayüzü.</w:t>
       </w:r>
     </w:p>
     <w:p>
@@ -3269,7 +3242,7 @@
           <w:color w:val="323232"/>
           <w:sz w:val="24"/>
         </w:rPr>
-        <w:t>3.3.2. Live Stock Query Page &amp; yfinance Inference Pipeline</w:t>
+        <w:t>3.3.2. Canlı Hisse Sorgulama Sayfası ve yfinance Çıkarım Hattı</w:t>
       </w:r>
     </w:p>
     <w:p>
@@ -3282,21 +3255,49 @@
           <w:rFonts w:ascii="Times New Roman" w:hAnsi="Times New Roman"/>
           <w:sz w:val="24"/>
         </w:rPr>
-        <w:t>In the live Streamlit backend (</w:t>
+        <w:t xml:space="preserve">Kullanıcı arayüz üzerinden bir BIST hisse kodu sorguladığında, Streamlit arka planda </w:t>
       </w:r>
       <w:r>
         <w:rPr>
           <w:rFonts w:ascii="Courier New" w:hAnsi="Courier New"/>
           <w:sz w:val="21"/>
         </w:rPr>
-        <w:t>app.py</w:t>
-      </w:r>
-      <w:r>
-        <w:rPr>
-          <w:rFonts w:ascii="Times New Roman" w:hAnsi="Times New Roman"/>
-          <w:sz w:val="24"/>
-        </w:rPr>
-        <w:t>), the serializations are loaded into memory and yfinance handles live price streams:</w:t>
+        <w:t>yfinance</w:t>
+      </w:r>
+      <w:r>
+        <w:rPr>
+          <w:rFonts w:ascii="Times New Roman" w:hAnsi="Times New Roman"/>
+          <w:sz w:val="24"/>
+        </w:rPr>
+        <w:t xml:space="preserve"> üzerinden hissenin son 1 yıllık günlük mum verilerini indirir. Teknik indikatör vektörünü hesapladıktan sonra </w:t>
+      </w:r>
+      <w:r>
+        <w:rPr>
+          <w:rFonts w:ascii="Courier New" w:hAnsi="Courier New"/>
+          <w:sz w:val="21"/>
+        </w:rPr>
+        <w:t>best_scaler_acm465.joblib</w:t>
+      </w:r>
+      <w:r>
+        <w:rPr>
+          <w:rFonts w:ascii="Times New Roman" w:hAnsi="Times New Roman"/>
+          <w:sz w:val="24"/>
+        </w:rPr>
+        <w:t xml:space="preserve"> ile normalize eder ve </w:t>
+      </w:r>
+      <w:r>
+        <w:rPr>
+          <w:rFonts w:ascii="Courier New" w:hAnsi="Courier New"/>
+          <w:sz w:val="21"/>
+        </w:rPr>
+        <w:t>best_model_acm465.joblib</w:t>
+      </w:r>
+      <w:r>
+        <w:rPr>
+          <w:rFonts w:ascii="Times New Roman" w:hAnsi="Times New Roman"/>
+          <w:sz w:val="24"/>
+        </w:rPr>
+        <w:t xml:space="preserve"> MLP modeline göndererek anlık çıkarım (inference) tahmini üretir:</w:t>
       </w:r>
     </w:p>
     <w:p>
@@ -3311,7 +3312,7 @@
           <w:color w:val="3C3C3C"/>
           <w:sz w:val="19"/>
         </w:rPr>
-        <w:t># Real-time loading and inference</w:t>
+        <w:t># Canlı veri çekme ve model çıkarım hattı</w:t>
       </w:r>
     </w:p>
     <w:p>
@@ -3517,7 +3518,7 @@
           <w:rFonts w:ascii="Times New Roman" w:hAnsi="Times New Roman"/>
           <w:sz w:val="24"/>
         </w:rPr>
-        <w:t>This pipeline allows the web dashboard to instantly generate active market predictions for any BIST stock.</w:t>
+        <w:t>Bu veri hattı sayesinde web panelinde anlık piyasa verilerine dayalı kararlar saniyeler içinde üretilmektedir.</w:t>
       </w:r>
     </w:p>
     <w:p>
@@ -3570,7 +3571,7 @@
           <w:color w:val="505050"/>
           <w:sz w:val="20"/>
         </w:rPr>
-        <w:t>Figure: Live Stock Forecasting Panel</w:t>
+        <w:t>Figure: Canlı Hisse Tahmin Arayüzü</w:t>
       </w:r>
     </w:p>
     <w:p>
@@ -3584,7 +3585,7 @@
           <w:i/>
           <w:sz w:val="24"/>
         </w:rPr>
-        <w:t>Figure 3.8: Real-time stock forecast panel UI.</w:t>
+        <w:t>Şekil 3.8: Canlı hisse sorgulama ve yapay zeka tahmin paneli arayüzü.</w:t>
       </w:r>
     </w:p>
     <w:p>
@@ -3600,7 +3601,7 @@
           <w:color w:val="323232"/>
           <w:sz w:val="24"/>
         </w:rPr>
-        <w:t>3.3.3. Historical Win-Rate Decision Engine</w:t>
+        <w:t>3.3.3. Tarihsel Başarı Oranı (Win Rate) Karar Motoru</w:t>
       </w:r>
     </w:p>
     <w:p>
@@ -3613,7 +3614,7 @@
           <w:rFonts w:ascii="Times New Roman" w:hAnsi="Times New Roman"/>
           <w:sz w:val="24"/>
         </w:rPr>
-        <w:t xml:space="preserve">A primary innovation in this terminal is the </w:t>
+        <w:t xml:space="preserve">BorsaNeuron'un en özgün özelliklerinden biri olan </w:t>
       </w:r>
       <w:r>
         <w:rPr>
@@ -3621,29 +3622,14 @@
           <w:b/>
           <w:sz w:val="24"/>
         </w:rPr>
-        <w:t>Historical Stock Win Rate Analyzer</w:t>
-      </w:r>
-      <w:r>
-        <w:rPr>
-          <w:rFonts w:ascii="Times New Roman" w:hAnsi="Times New Roman"/>
-          <w:sz w:val="24"/>
-        </w:rPr>
-        <w:t xml:space="preserve">. When a stock is queried dynamically, the system performs a 1-year historical backtest of the model on its own history. It calculates the stock's specific </w:t>
-      </w:r>
-      <w:r>
-        <w:rPr>
-          <w:rFonts w:ascii="Times New Roman" w:hAnsi="Times New Roman"/>
-          <w:b/>
-          <w:sz w:val="24"/>
-        </w:rPr>
-        <w:t>Win Rate</w:t>
-      </w:r>
-      <w:r>
-        <w:rPr>
-          <w:rFonts w:ascii="Times New Roman" w:hAnsi="Times New Roman"/>
-          <w:sz w:val="24"/>
-        </w:rPr>
-        <w:t xml:space="preserve"> under the AI strategy:</w:t>
+        <w:t>Tarihsel Başarı Oranı Karar Motoru</w:t>
+      </w:r>
+      <w:r>
+        <w:rPr>
+          <w:rFonts w:ascii="Times New Roman" w:hAnsi="Times New Roman"/>
+          <w:sz w:val="24"/>
+        </w:rPr>
+        <w:t>, makine öğrenmesi modelinin her hisse senedinde aynı kararlılıkta çalışamayacağı gerçeği üzerine kurulmuştur. Sistem, sorgulanan hissenin son 1 yıllık tarihsel verisinde modelin ürettiği alım sinyallerinin geriye dönük doğruluk oranını hesaplar:</w:t>
       </w:r>
     </w:p>
     <w:p>
@@ -3656,7 +3642,15 @@
           <w:rFonts w:ascii="Times New Roman" w:hAnsi="Times New Roman"/>
           <w:sz w:val="24"/>
         </w:rPr>
-        <w:t>$$\text{Win Rate} = \frac{\text{Correct Bullish Forecasts}}{\text{Total Bullish Signals}} \times 100$$</w:t>
+        <w:t>$$</w:t>
+        <w:tab/>
+        <w:t>ext{Başarı Oranı} = \frac{</w:t>
+        <w:tab/>
+        <w:t>ext{Doğru Çıkan Yükseliş Sinyalleri}}{</w:t>
+        <w:tab/>
+        <w:t xml:space="preserve">ext{Toplam Üretilen Yükseliş Sinyalleri}} </w:t>
+        <w:tab/>
+        <w:t>imes 100$$</w:t>
       </w:r>
     </w:p>
     <w:p>
@@ -3669,7 +3663,7 @@
           <w:rFonts w:ascii="Times New Roman" w:hAnsi="Times New Roman"/>
           <w:sz w:val="24"/>
         </w:rPr>
-        <w:t>The system displays this as a dedicated decision factor. If the stock has a history of high compliance (Win Rate &gt; 60%), it outputs a strong buy confirmation. If the stock is highly volatile or erratic (Win Rate &lt; 48%), it issues an active risk warning.</w:t>
+        <w:t>Bu değer karar sürecine bir filtre olarak eklenir. Eğer hissenin tarihsel başarı oranı %60'tan büyükse modele ek alım onayı verilir, %48'in altındaysa sistem kullanıcıya yüksek risk uyarısı gösterir.</w:t>
       </w:r>
     </w:p>
     <w:p>
@@ -3685,7 +3679,7 @@
           <w:color w:val="323232"/>
           <w:sz w:val="24"/>
         </w:rPr>
-        <w:t>3.3.4. Sector Peer Benchmarking</w:t>
+        <w:t>3.3.4. Sektörel Akran Kıyaslaması</w:t>
       </w:r>
     </w:p>
     <w:p>
@@ -3698,7 +3692,7 @@
           <w:rFonts w:ascii="Times New Roman" w:hAnsi="Times New Roman"/>
           <w:sz w:val="24"/>
         </w:rPr>
-        <w:t>The terminal groups stocks into sectors (Holding, Banking, Industrial, Energy, Logistics, etc.) and compares the queried stock's live metrics against the sector's historical averages. This provides direct macro-context to traders.</w:t>
+        <w:t>Platform sorgulanan hisseyi kendi sektörüyle (Bankacılık, Sanayi, Enerji, Ulaştırma vb.) gruplandırarak, hissenin mevcut teknik göstergelerini (RSI, Hacim Trendi vb.) sektör ortalamalarıyla kıyaslar. Bu sayede makro düzeyde sektörel bir karşılaştırma imkanı sunulur.</w:t>
       </w:r>
     </w:p>
     <w:p>
@@ -3714,7 +3708,7 @@
           <w:color w:val="323232"/>
           <w:sz w:val="24"/>
         </w:rPr>
-        <w:t>3.3.5. Interactive Candlestick Plotly Visualizer</w:t>
+        <w:t>3.3.5. İnteraktif Grafik Görselleştirici (Plotly)</w:t>
       </w:r>
     </w:p>
     <w:p>
@@ -3727,7 +3721,7 @@
           <w:rFonts w:ascii="Times New Roman" w:hAnsi="Times New Roman"/>
           <w:sz w:val="24"/>
         </w:rPr>
-        <w:t>BorsaNeuron renders a Plotly Candlestick chart overlaid with Bollinger Bands and moving averages. Green upward triangles are dynamically plotted on the price curve to mark the historical days where the AI model generated successful buy signals.</w:t>
+        <w:t>BorsaNeuron, Bollinger Bantları ve hareketli ortalamalarla zenginleştirilmiş etkileşimli bir Plotly şamdan (candlestick) grafiği çizer. Grafiğin üzerinde, yapay zekanın geçmişte ürettiği başarılı alım noktaları yeşil yukarı yönlü üçgenlerle dinamik olarak işaretlenir.</w:t>
       </w:r>
     </w:p>
     <w:p>
@@ -3743,7 +3737,7 @@
           <w:color w:val="323232"/>
           <w:sz w:val="24"/>
         </w:rPr>
-        <w:t>3.3.6. Live Portfolio Backtest Simulator</w:t>
+        <w:t>3.3.6. Canlı Portföy Simülasyonu</w:t>
       </w:r>
     </w:p>
     <w:p>
@@ -3756,7 +3750,7 @@
           <w:rFonts w:ascii="Times New Roman" w:hAnsi="Times New Roman"/>
           <w:sz w:val="24"/>
         </w:rPr>
-        <w:t xml:space="preserve">A portfolio growth simulator is integrated into the stock query panel. It shows a cumulative growth curve comparing </w:t>
+        <w:t xml:space="preserve">Arayüze entegre edilmiş portföy simülatörü, başlangıçta 100.000 TL sermaye ile yola çıkıldığında </w:t>
       </w:r>
       <w:r>
         <w:rPr>
@@ -3764,14 +3758,14 @@
           <w:b/>
           <w:sz w:val="24"/>
         </w:rPr>
-        <w:t>BorsaNeuron AI Strategy vs. Buy &amp; Hold Index</w:t>
-      </w:r>
-      <w:r>
-        <w:rPr>
-          <w:rFonts w:ascii="Times New Roman" w:hAnsi="Times New Roman"/>
-          <w:sz w:val="24"/>
-        </w:rPr>
-        <w:t xml:space="preserve"> over the last 1 year, starting with a hypothetical 100,000 TL capital.</w:t>
+        <w:t>BorsaNeuron Yapay Zeka Stratejisi vs. Al ve Tut (Buy &amp; Hold)</w:t>
+      </w:r>
+      <w:r>
+        <w:rPr>
+          <w:rFonts w:ascii="Times New Roman" w:hAnsi="Times New Roman"/>
+          <w:sz w:val="24"/>
+        </w:rPr>
+        <w:t xml:space="preserve"> getiri eğrilerini son 1 yıllık tarihsel veri üzerinde karşılaştırmalı olarak simüle eder.</w:t>
       </w:r>
     </w:p>
     <w:p>
@@ -3824,7 +3818,7 @@
           <w:color w:val="505050"/>
           <w:sz w:val="20"/>
         </w:rPr>
-        <w:t>Figure: What-If Scenario Simulation Panel</w:t>
+        <w:t>Figure: Senaryo Analizi ve Karar Arayüzü</w:t>
       </w:r>
     </w:p>
     <w:p>
@@ -3838,7 +3832,7 @@
           <w:i/>
           <w:sz w:val="24"/>
         </w:rPr>
-        <w:t>Figure 3.9: What-If Scenario UI, displaying dynamic simulation sliders.</w:t>
+        <w:t>Şekil 3.9: Streamlit dinamik simülasyon kaydırıcıları ve senaryo analizi paneli.</w:t>
       </w:r>
     </w:p>
     <w:p>
@@ -3891,7 +3885,7 @@
           <w:color w:val="505050"/>
           <w:sz w:val="20"/>
         </w:rPr>
-        <w:t>Figure: Market Regime Cluster Profiles Analysis</w:t>
+        <w:t>Figure: K-Means Küme Profilleri Yoğunluk Analizi</w:t>
       </w:r>
     </w:p>
     <w:p>
@@ -3905,7 +3899,7 @@
           <w:i/>
           <w:sz w:val="24"/>
         </w:rPr>
-        <w:t>Figure 3.10: K-Means cluster profile density analysis.</w:t>
+        <w:t>Şekil 3.10: K-Means kümeleme profillerinin indikatör yoğunluk analiz grafiği.</w:t>
       </w:r>
     </w:p>
     <w:p>
@@ -3958,7 +3952,7 @@
           <w:color w:val="505050"/>
           <w:sz w:val="20"/>
         </w:rPr>
-        <w:t>Figure: Prophet Live Forecasting</w:t>
+        <w:t>Figure: Prophet Fiyat Tahmin Hattı</w:t>
       </w:r>
     </w:p>
     <w:p>
@@ -3972,7 +3966,7 @@
           <w:i/>
           <w:sz w:val="24"/>
         </w:rPr>
-        <w:t>Figure 3.11: Live Prophet price path forecast interface.</w:t>
+        <w:t>Şekil 3.11: Canlı Prophet zaman serisi fiyat tahmin arayüzü.</w:t>
       </w:r>
     </w:p>
     <w:p>
@@ -4025,7 +4019,7 @@
           <w:color w:val="505050"/>
           <w:sz w:val="20"/>
         </w:rPr>
-        <w:t>Figure: Algorithmic Trading Backtest Strategy Performance</w:t>
+        <w:t>Figure: Algoritmik Portföy Backtest Getiri Karşılaştırması</w:t>
       </w:r>
     </w:p>
     <w:p>
@@ -4039,7 +4033,7 @@
           <w:i/>
           <w:sz w:val="24"/>
         </w:rPr>
-        <w:t>Figure 3.12: Backtesting performance charting comparing active BorsaNeuron prediction signals.</w:t>
+        <w:t>Şekil 3.12: BorsaNeuron yapay zeka sinyalleri ile Al ve Tut stratejisinin getiri karşılaştırma grafiği.</w:t>
       </w:r>
     </w:p>
     <w:p>
@@ -4055,7 +4049,7 @@
           <w:color w:val="1E1E1E"/>
           <w:sz w:val="28"/>
         </w:rPr>
-        <w:t>3.4. Automated Geometric Pattern Recognition Engine</w:t>
+        <w:t>3.4. Otomatik Geometrik Formasyon Tanıma Motoru</w:t>
       </w:r>
     </w:p>
     <w:p>
@@ -4071,7 +4065,7 @@
           <w:color w:val="323232"/>
           <w:sz w:val="24"/>
         </w:rPr>
-        <w:t>3.4.1. Peak and Trough Extraction via ZigZag Indicator</w:t>
+        <w:t>3.4.1. ZigZag İndikatörü ile Tepe ve Dip Noktalarının Çıkarılması</w:t>
       </w:r>
     </w:p>
     <w:p>
@@ -4084,7 +4078,7 @@
           <w:rFonts w:ascii="Times New Roman" w:hAnsi="Times New Roman"/>
           <w:sz w:val="24"/>
         </w:rPr>
-        <w:t xml:space="preserve">To supplement statistical forecasts, BorsaNeuron features an automated geometric chart pattern recognition engine located in </w:t>
+        <w:t xml:space="preserve">İndikatör tahminlerine ek olarak, BorsaNeuron </w:t>
       </w:r>
       <w:r>
         <w:rPr>
@@ -4098,7 +4092,7 @@
           <w:rFonts w:ascii="Times New Roman" w:hAnsi="Times New Roman"/>
           <w:sz w:val="24"/>
         </w:rPr>
-        <w:t>. The scan uses raw price swing points calculated via a ZigZag indicator. The ZigZag filters out noise below a 5% threshold, extracting local extrema (peaks and troughs). Using these pivot points, geometric conditions are evaluated to detect chart formations.</w:t>
+        <w:t xml:space="preserve"> modülünde yer alan matematiksel bir formasyon tarayıcı içerir. Tarayıcı, fiyat hareketlerindeki %5'in altındaki küçük gürültüleri filtreleyerek yerel tepe ve dip noktalarını (extrema) çıkaran bir ZigZag algoritması kullanır. Tespit edilen bu pivot noktaları geometrik eşik kurallarına tabi tutularak klasik formasyonlar taranır.</w:t>
       </w:r>
     </w:p>
     <w:p>
@@ -4114,7 +4108,7 @@
           <w:color w:val="323232"/>
           <w:sz w:val="24"/>
         </w:rPr>
-        <w:t>3.4.2. Head and Shoulders (OBO) &amp; Inverted Head and Shoulders (TOBO)</w:t>
+        <w:t>3.4.2. Omuz-Baş-Omuz (OBO) ve Ters Omuz-Baş-Omuz (TOBO) Formasyonları</w:t>
       </w:r>
     </w:p>
     <w:p>
@@ -4128,14 +4122,14 @@
           <w:b/>
           <w:sz w:val="24"/>
         </w:rPr>
-        <w:t>TOBO (Inverted Head &amp; Shoulders):</w:t>
-      </w:r>
-      <w:r>
-        <w:rPr>
-          <w:rFonts w:ascii="Times New Roman" w:hAnsi="Times New Roman"/>
-          <w:sz w:val="24"/>
-        </w:rPr>
-        <w:t xml:space="preserve"> Identified by finding a sequence of three consecutive troughs ($L_1$, $L_2$, $L_3$) where the center trough (Head) is lower than the left and right troughs (Shoulders):</w:t>
+        <w:t>TOBO (Ters Omuz-Baş-Omuz):</w:t>
+      </w:r>
+      <w:r>
+        <w:rPr>
+          <w:rFonts w:ascii="Times New Roman" w:hAnsi="Times New Roman"/>
+          <w:sz w:val="24"/>
+        </w:rPr>
+        <w:t xml:space="preserve"> Yan yana oluşan üç ardışık dip noktası ($L_1$, $L_2$, $L_3$) analiz edilir. Ortadaki dip noktasının (Baş) sağ ve soldaki diplerden (Omuzlar) daha aşağıda olması şartı aranır:</w:t>
       </w:r>
     </w:p>
     <w:p>
@@ -4148,7 +4142,9 @@
           <w:rFonts w:ascii="Times New Roman" w:hAnsi="Times New Roman"/>
           <w:sz w:val="24"/>
         </w:rPr>
-        <w:t>$$L_2 &lt; L_1 \quad \text{and} \quad L_2 &lt; L_3$$</w:t>
+        <w:t xml:space="preserve">$$L_2 &lt; L_1 \quad </w:t>
+        <w:tab/>
+        <w:t>ext{ve} \quad L_2 &lt; L_3$$</w:t>
       </w:r>
     </w:p>
     <w:p>
@@ -4161,7 +4157,7 @@
           <w:rFonts w:ascii="Times New Roman" w:hAnsi="Times New Roman"/>
           <w:sz w:val="24"/>
         </w:rPr>
-        <w:t>The intermediate peaks form the neckline. The neckline slope is evaluated to confirm a breakout.</w:t>
+        <w:t>Bu diplerin arasındaki tepelerden geçen boyun çizgisinin eğimi kontrol edilerek kırılım teyit edilir.</w:t>
       </w:r>
     </w:p>
     <w:p>
@@ -4175,14 +4171,14 @@
           <w:b/>
           <w:sz w:val="24"/>
         </w:rPr>
-        <w:t>OBO (Head &amp; Shoulders):</w:t>
-      </w:r>
-      <w:r>
-        <w:rPr>
-          <w:rFonts w:ascii="Times New Roman" w:hAnsi="Times New Roman"/>
-          <w:sz w:val="24"/>
-        </w:rPr>
-        <w:t xml:space="preserve"> The inverse logic is applied using three consecutive peaks ($H_1$, $H_2$, $H_3$) where the head is higher than the shoulders:</w:t>
+        <w:t>OBO (Omuz-Baş-Omuz):</w:t>
+      </w:r>
+      <w:r>
+        <w:rPr>
+          <w:rFonts w:ascii="Times New Roman" w:hAnsi="Times New Roman"/>
+          <w:sz w:val="24"/>
+        </w:rPr>
+        <w:t xml:space="preserve"> Üç ardışık tepe noktası ($H_1$, $H_2$, $H_3$) kullanılarak ters mantık işletilir:</w:t>
       </w:r>
     </w:p>
     <w:p>
@@ -4195,7 +4191,9 @@
           <w:rFonts w:ascii="Times New Roman" w:hAnsi="Times New Roman"/>
           <w:sz w:val="24"/>
         </w:rPr>
-        <w:t>$$H_2 &gt; H_1 \quad \text{and} \quad H_2 &gt; H_3$$</w:t>
+        <w:t xml:space="preserve">$$H_2 &gt; H_1 \quad </w:t>
+        <w:tab/>
+        <w:t>ext{ve} \quad H_2 &gt; H_3$$</w:t>
       </w:r>
     </w:p>
     <w:p>
@@ -4208,7 +4206,7 @@
           <w:rFonts w:ascii="Times New Roman" w:hAnsi="Times New Roman"/>
           <w:sz w:val="24"/>
         </w:rPr>
-        <w:t>A break below the neckline triggers a bearish reversal warning.</w:t>
+        <w:t>Boyun çizgisinin aşağı yönlü kırılması durumunda düşüş sinyali üretilir.</w:t>
       </w:r>
     </w:p>
     <w:p>
@@ -4224,7 +4222,7 @@
           <w:color w:val="323232"/>
           <w:sz w:val="24"/>
         </w:rPr>
-        <w:t>3.4.3. Cup &amp; Handle &amp; Flag Formations</w:t>
+        <w:t>3.4.3. Çanak-Kulp ve Bayrak Formasyonları</w:t>
       </w:r>
     </w:p>
     <w:p>
@@ -4238,14 +4236,14 @@
           <w:b/>
           <w:sz w:val="24"/>
         </w:rPr>
-        <w:t>Cup &amp; Handle:</w:t>
-      </w:r>
-      <w:r>
-        <w:rPr>
-          <w:rFonts w:ascii="Times New Roman" w:hAnsi="Times New Roman"/>
-          <w:sz w:val="24"/>
-        </w:rPr>
-        <w:t xml:space="preserve"> Detected by identifying a rounded U-shaped base (the cup) followed by a short, downward-slanted consolidation channel (the handle). The depth of the cup must satisfy:</w:t>
+        <w:t>Çanak-Kulp:</w:t>
+      </w:r>
+      <w:r>
+        <w:rPr>
+          <w:rFonts w:ascii="Times New Roman" w:hAnsi="Times New Roman"/>
+          <w:sz w:val="24"/>
+        </w:rPr>
+        <w:t xml:space="preserve"> U şeklinde geniş bir çanak dip yapısı ve ardından gelen daha sığ bir kulp konsolidasyonu aranır. Çanağın derinliği şu koşulu sağlamalıdır:</w:t>
       </w:r>
     </w:p>
     <w:p>
@@ -4258,7 +4256,15 @@
           <w:rFonts w:ascii="Times New Roman" w:hAnsi="Times New Roman"/>
           <w:sz w:val="24"/>
         </w:rPr>
-        <w:t xml:space="preserve">$$\text{Cup Depth} = \frac{\text{Cup Lip} - \text{Cup Bottom}}{\text{Cup Lip}} \in </w:t>
+        <w:t>$$</w:t>
+        <w:tab/>
+        <w:t>ext{Çanak Derinliği} = \frac{</w:t>
+        <w:tab/>
+        <w:t xml:space="preserve">ext{Çanak Kenarı} - </w:t>
+        <w:tab/>
+        <w:t>ext{Çanak Dibi}}{</w:t>
+        <w:tab/>
+        <w:t xml:space="preserve">ext{Çanak Kenarı}} \in </w:t>
       </w:r>
       <w:r>
         <w:rPr>
@@ -4278,7 +4284,7 @@
           <w:rFonts w:ascii="Times New Roman" w:hAnsi="Times New Roman"/>
           <w:sz w:val="24"/>
         </w:rPr>
-        <w:t>The handle must not retrace more than 50% of the cup's depth.</w:t>
+        <w:t>Kulp yapısı çanak derinliğinin %50'sinden daha fazla aşağı sarkmamalıdır.</w:t>
       </w:r>
     </w:p>
     <w:p>
@@ -4292,14 +4298,14 @@
           <w:b/>
           <w:sz w:val="24"/>
         </w:rPr>
-        <w:t>Flag:</w:t>
-      </w:r>
-      <w:r>
-        <w:rPr>
-          <w:rFonts w:ascii="Times New Roman" w:hAnsi="Times New Roman"/>
-          <w:sz w:val="24"/>
-        </w:rPr>
-        <w:t xml:space="preserve"> Identified by identifying a strong, vertical price movement (the flagpole) followed by a narrow, parallel consolidation range (the flag). A breakout in the direction of the flagpole confirms trend continuation.</w:t>
+        <w:t>Bayrak:</w:t>
+      </w:r>
+      <w:r>
+        <w:rPr>
+          <w:rFonts w:ascii="Times New Roman" w:hAnsi="Times New Roman"/>
+          <w:sz w:val="24"/>
+        </w:rPr>
+        <w:t xml:space="preserve"> Fiyatta görülen sert ve dikey bir yükselişin (bayrak direği) ardından oluşan dar ve paralel bir konsolidasyon kanalı (bayrak) tespit edilir. Kanalın yukarı yönlü kırılması trendin devam edeceğini teyit eder.</w:t>
       </w:r>
     </w:p>
     <w:p>
@@ -4315,7 +4321,7 @@
           <w:color w:val="323232"/>
           <w:sz w:val="24"/>
         </w:rPr>
-        <w:t>3.4.4. Double Bottom &amp; Double Top Formations</w:t>
+        <w:t>3.4.4. İkili Dip ve İkili Tepe Formasyonları</w:t>
       </w:r>
     </w:p>
     <w:p>
@@ -4329,14 +4335,14 @@
           <w:b/>
           <w:sz w:val="24"/>
         </w:rPr>
-        <w:t>Double Bottom:</w:t>
-      </w:r>
-      <w:r>
-        <w:rPr>
-          <w:rFonts w:ascii="Times New Roman" w:hAnsi="Times New Roman"/>
-          <w:sz w:val="24"/>
-        </w:rPr>
-        <w:t xml:space="preserve"> To detect a double bottom pattern, the analyzer searches for a sequence of two consecutive troughs ($L_1$, $L_2$) and an intervening peak ($H_1$). The two troughs must occur at approximately the same price level, within a 2% horizontal tolerance limit:</w:t>
+        <w:t>İkili Dip:</w:t>
+      </w:r>
+      <w:r>
+        <w:rPr>
+          <w:rFonts w:ascii="Times New Roman" w:hAnsi="Times New Roman"/>
+          <w:sz w:val="24"/>
+        </w:rPr>
+        <w:t xml:space="preserve"> İki ardışık dip noktasının ($L_1$, $L_2$) birbirine çok yakın fiyat seviyelerinde oluşması koşulu aranır. Yatay tolerans limiti maksimum %2 olarak belirlenmiştir:</w:t>
       </w:r>
     </w:p>
     <w:p>
@@ -4349,7 +4355,7 @@
           <w:rFonts w:ascii="Times New Roman" w:hAnsi="Times New Roman"/>
           <w:sz w:val="24"/>
         </w:rPr>
-        <w:t>$$\left| \frac{L_1 - L_2}{\min(L_1, L_2)} \right| \le 0.02$$</w:t>
+        <w:t>$$\left| \frac{L_1 - L_2}{\min(L_1, L_2)}</w:t>
       </w:r>
     </w:p>
     <w:p>
@@ -4362,7 +4368,7 @@
           <w:rFonts w:ascii="Times New Roman" w:hAnsi="Times New Roman"/>
           <w:sz w:val="24"/>
         </w:rPr>
-        <w:t>The intervening peak ($H_1$) forms the resistance neckline. A confirmed breakout is registered when the close price exceeds the neckline:</w:t>
+        <w:t>ight| \le 0.02$$</w:t>
       </w:r>
     </w:p>
     <w:p>
@@ -4375,7 +4381,22 @@
           <w:rFonts w:ascii="Times New Roman" w:hAnsi="Times New Roman"/>
           <w:sz w:val="24"/>
         </w:rPr>
-        <w:t>$$\text{Close} &gt; H_1$$</w:t>
+        <w:t>Aradaki tepenin oluşturduğu direnç boyun çizgisinin ($H_1$) yukarı yönlü geçilmesiyle formasyon tetiklenir:</w:t>
+      </w:r>
+    </w:p>
+    <w:p>
+      <w:pPr>
+        <w:spacing w:line="360" w:lineRule="auto" w:after="160"/>
+        <w:jc w:val="both"/>
+      </w:pPr>
+      <w:r>
+        <w:rPr>
+          <w:rFonts w:ascii="Times New Roman" w:hAnsi="Times New Roman"/>
+          <w:sz w:val="24"/>
+        </w:rPr>
+        <w:t>$$</w:t>
+        <w:tab/>
+        <w:t>ext{Kapanış Fiyatı} &gt; H_1$$</w:t>
       </w:r>
     </w:p>
     <w:p>
@@ -4389,14 +4410,14 @@
           <w:b/>
           <w:sz w:val="24"/>
         </w:rPr>
-        <w:t>Double Top:</w:t>
-      </w:r>
-      <w:r>
-        <w:rPr>
-          <w:rFonts w:ascii="Times New Roman" w:hAnsi="Times New Roman"/>
-          <w:sz w:val="24"/>
-        </w:rPr>
-        <w:t xml:space="preserve"> The double top is detected by identifying two consecutive peaks ($H_1$, $H_2$) at approximately the same resistance level, separated by a trough ($L_1$):</w:t>
+        <w:t>İkili Tepe:</w:t>
+      </w:r>
+      <w:r>
+        <w:rPr>
+          <w:rFonts w:ascii="Times New Roman" w:hAnsi="Times New Roman"/>
+          <w:sz w:val="24"/>
+        </w:rPr>
+        <w:t xml:space="preserve"> İki ardışık tepe noktasının ($H_1$, $H_2$) yaklaşık aynı direnç seviyesinde oluşması durumudur:</w:t>
       </w:r>
     </w:p>
     <w:p>
@@ -4409,7 +4430,7 @@
           <w:rFonts w:ascii="Times New Roman" w:hAnsi="Times New Roman"/>
           <w:sz w:val="24"/>
         </w:rPr>
-        <w:t>$$\left| \frac{H_1 - H_2}{\min(H_1, H_2)} \right| \le 0.02$$</w:t>
+        <w:t>$$\left| \frac{H_1 - H_2}{\min(H_1, H_2)}</w:t>
       </w:r>
     </w:p>
     <w:p>
@@ -4422,7 +4443,7 @@
           <w:rFonts w:ascii="Times New Roman" w:hAnsi="Times New Roman"/>
           <w:sz w:val="24"/>
         </w:rPr>
-        <w:t>A bearish breakout is flagged when the close price falls below the support neckline:</w:t>
+        <w:t>ight| \le 0.02$$</w:t>
       </w:r>
     </w:p>
     <w:p>
@@ -4435,7 +4456,22 @@
           <w:rFonts w:ascii="Times New Roman" w:hAnsi="Times New Roman"/>
           <w:sz w:val="24"/>
         </w:rPr>
-        <w:t>$$\text{Close} &lt; L_1$$</w:t>
+        <w:t>Aralarındaki dip noktası olan boyun desteğinin ($L_1$) aşağı yönlü kırılması formasyonu onaylar:</w:t>
+      </w:r>
+    </w:p>
+    <w:p>
+      <w:pPr>
+        <w:spacing w:line="360" w:lineRule="auto" w:after="160"/>
+        <w:jc w:val="both"/>
+      </w:pPr>
+      <w:r>
+        <w:rPr>
+          <w:rFonts w:ascii="Times New Roman" w:hAnsi="Times New Roman"/>
+          <w:sz w:val="24"/>
+        </w:rPr>
+        <w:t>$$</w:t>
+        <w:tab/>
+        <w:t>ext{Kapanış Fiyatı} &lt; L_1$$</w:t>
       </w:r>
     </w:p>
     <w:p>
@@ -4456,7 +4492,7 @@
           <w:color w:val="111111"/>
           <w:sz w:val="36"/>
         </w:rPr>
-        <w:t>4. DEPLOYING PROJECT</w:t>
+        <w:t>4. PROJENİN YAYINA ALINMASI VE DAĞITIMI</w:t>
       </w:r>
     </w:p>
     <w:p>
@@ -4469,7 +4505,7 @@
           <w:rFonts w:ascii="Times New Roman" w:hAnsi="Times New Roman"/>
           <w:sz w:val="24"/>
         </w:rPr>
-        <w:t>Following modeling and dashboard construction, BorsaNeuron was containerized using Docker to ensure consistent execution across local developer workstations and cloud production servers.</w:t>
+        <w:t>Geliştirilen BorsaNeuron yazılımının geliştirici bilgisayarlarında ve canlı sunucu ortamlarında tutarlı bir şekilde çalışabilmesi amacıyla Docker konteynerizasyonu uygulanmıştır.</w:t>
       </w:r>
     </w:p>
     <w:p>
@@ -4485,7 +4521,7 @@
           <w:color w:val="1E1E1E"/>
           <w:sz w:val="28"/>
         </w:rPr>
-        <w:t>4.1. Docker Containerization</w:t>
+        <w:t>4.1. Docker ile Konteynerleştirme</w:t>
       </w:r>
     </w:p>
     <w:p>
@@ -4498,7 +4534,7 @@
           <w:rFonts w:ascii="Times New Roman" w:hAnsi="Times New Roman"/>
           <w:sz w:val="24"/>
         </w:rPr>
-        <w:t xml:space="preserve">A standardized </w:t>
+        <w:t xml:space="preserve">Sistem bağımlılıklarını izole eden ve hafif bir çalışma ortamı sunan </w:t>
       </w:r>
       <w:r>
         <w:rPr>
@@ -4512,7 +4548,7 @@
           <w:rFonts w:ascii="Times New Roman" w:hAnsi="Times New Roman"/>
           <w:sz w:val="24"/>
         </w:rPr>
-        <w:t xml:space="preserve"> was created:</w:t>
+        <w:t xml:space="preserve"> hazırlanmıştır:</w:t>
       </w:r>
     </w:p>
     <w:p>
@@ -4587,7 +4623,7 @@
           <w:color w:val="3C3C3C"/>
           <w:sz w:val="19"/>
         </w:rPr>
-        <w:t>RUN apt-get update &amp;&amp; apt-get install -y \</w:t>
+        <w:t>RUN apt-get update &amp;&amp; apt-get install -y     build-essential     curl     software-properties-common     git     &amp;&amp; rm -rf /var/lib/apt/lists/*</w:t>
       </w:r>
     </w:p>
     <w:p>
@@ -4602,7 +4638,7 @@
           <w:color w:val="3C3C3C"/>
           <w:sz w:val="19"/>
         </w:rPr>
-        <w:t xml:space="preserve">    build-essential \</w:t>
+        <w:t>COPY requirements.txt .</w:t>
       </w:r>
     </w:p>
     <w:p>
@@ -4617,7 +4653,7 @@
           <w:color w:val="3C3C3C"/>
           <w:sz w:val="19"/>
         </w:rPr>
-        <w:t xml:space="preserve">    curl \</w:t>
+        <w:t>RUN pip install --no-cache-dir -r requirements.txt</w:t>
       </w:r>
     </w:p>
     <w:p>
@@ -4632,7 +4668,7 @@
           <w:color w:val="3C3C3C"/>
           <w:sz w:val="19"/>
         </w:rPr>
-        <w:t xml:space="preserve">    software-properties-common \</w:t>
+        <w:t>COPY . .</w:t>
       </w:r>
     </w:p>
     <w:p>
@@ -4647,7 +4683,7 @@
           <w:color w:val="3C3C3C"/>
           <w:sz w:val="19"/>
         </w:rPr>
-        <w:t xml:space="preserve">    git \</w:t>
+        <w:t>EXPOSE 8501</w:t>
       </w:r>
     </w:p>
     <w:p>
@@ -4662,7 +4698,7 @@
           <w:color w:val="3C3C3C"/>
           <w:sz w:val="19"/>
         </w:rPr>
-        <w:t xml:space="preserve">    &amp;&amp; rm -rf /var/lib/apt/lists/*</w:t>
+        <w:t>HEALTHCHECK CMD curl --fail http://localhost:8501/_stcore/health</w:t>
       </w:r>
     </w:p>
     <w:p>
@@ -4677,7 +4713,36 @@
           <w:color w:val="3C3C3C"/>
           <w:sz w:val="19"/>
         </w:rPr>
-        <w:t>COPY requirements.txt .</w:t>
+        <w:t>ENTRYPOINT ["streamlit", "run", "src/app.py", "--server.port=8501", "--server.address=0.0.0.0"]</w:t>
+      </w:r>
+    </w:p>
+    <w:p>
+      <w:pPr>
+        <w:pStyle w:val="Heading2"/>
+        <w:spacing w:before="240" w:after="120"/>
+        <w:jc w:val="left"/>
+      </w:pPr>
+      <w:r>
+        <w:rPr>
+          <w:rFonts w:ascii="Times New Roman" w:hAnsi="Times New Roman"/>
+          <w:b/>
+          <w:color w:val="1E1E1E"/>
+          <w:sz w:val="28"/>
+        </w:rPr>
+        <w:t>4.2. Canlı Sunucu Kurulumu ve Çalıştırma Komutları</w:t>
+      </w:r>
+    </w:p>
+    <w:p>
+      <w:pPr>
+        <w:spacing w:line="360" w:lineRule="auto" w:after="160"/>
+        <w:jc w:val="both"/>
+      </w:pPr>
+      <w:r>
+        <w:rPr>
+          <w:rFonts w:ascii="Times New Roman" w:hAnsi="Times New Roman"/>
+          <w:sz w:val="24"/>
+        </w:rPr>
+        <w:t>Docker imajını oluşturmak ve konteyneri arka planda çalıştırmak için sırasıyla şu komut satırları kullanılır:</w:t>
       </w:r>
     </w:p>
     <w:p>
@@ -4692,7 +4757,7 @@
           <w:color w:val="3C3C3C"/>
           <w:sz w:val="19"/>
         </w:rPr>
-        <w:t>RUN pip install --no-cache-dir -r requirements.txt</w:t>
+        <w:t># Docker imajını derleme</w:t>
       </w:r>
     </w:p>
     <w:p>
@@ -4707,7 +4772,7 @@
           <w:color w:val="3C3C3C"/>
           <w:sz w:val="19"/>
         </w:rPr>
-        <w:t>COPY . .</w:t>
+        <w:t>docker build -t borsaneuron-app:latest .</w:t>
       </w:r>
     </w:p>
     <w:p>
@@ -4722,7 +4787,6 @@
           <w:color w:val="3C3C3C"/>
           <w:sz w:val="19"/>
         </w:rPr>
-        <w:t>EXPOSE 8501</w:t>
       </w:r>
     </w:p>
     <w:p>
@@ -4737,7 +4801,7 @@
           <w:color w:val="3C3C3C"/>
           <w:sz w:val="19"/>
         </w:rPr>
-        <w:t>HEALTHCHECK CMD curl --fail http://localhost:8501/_stcore/health</w:t>
+        <w:t># Port yönlendirmesi yaparak konteyneri arka planda (detached) başlatma</w:t>
       </w:r>
     </w:p>
     <w:p>
@@ -4752,23 +4816,7 @@
           <w:color w:val="3C3C3C"/>
           <w:sz w:val="19"/>
         </w:rPr>
-        <w:t>ENTRYPOINT ["streamlit", "run", "src/app.py", "--server.port=8501", "--server.address=0.0.0.0"]</w:t>
-      </w:r>
-    </w:p>
-    <w:p>
-      <w:pPr>
-        <w:pStyle w:val="Heading2"/>
-        <w:spacing w:before="240" w:after="120"/>
-        <w:jc w:val="left"/>
-      </w:pPr>
-      <w:r>
-        <w:rPr>
-          <w:rFonts w:ascii="Times New Roman" w:hAnsi="Times New Roman"/>
-          <w:b/>
-          <w:color w:val="1E1E1E"/>
-          <w:sz w:val="28"/>
-        </w:rPr>
-        <w:t>4.2. Production Setup and Server Run Commands</w:t>
+        <w:t>docker run -d -p 80:8501 --name borsaneuron-prod borsaneuron-app:latest</w:t>
       </w:r>
     </w:p>
     <w:p>
@@ -4781,7 +4829,41 @@
           <w:rFonts w:ascii="Times New Roman" w:hAnsi="Times New Roman"/>
           <w:sz w:val="24"/>
         </w:rPr>
-        <w:t>To build the image and spin up the production container, the following commands are executed:</w:t>
+        <w:t>Bu sayede Streamlit'in varsayılan 8501 portu doğrudan ana makinenin 80 portuna (HTTP) yönlendirilerek web sitesi yayına alınmış olur.</w:t>
+      </w:r>
+    </w:p>
+    <w:p>
+      <w:r>
+        <w:br w:type="page"/>
+      </w:r>
+    </w:p>
+    <w:p>
+      <w:pPr>
+        <w:pStyle w:val="Heading1"/>
+        <w:spacing w:before="360" w:after="160"/>
+        <w:jc w:val="left"/>
+      </w:pPr>
+      <w:r>
+        <w:rPr>
+          <w:rFonts w:ascii="Times New Roman" w:hAnsi="Times New Roman"/>
+          <w:b/>
+          <w:color w:val="111111"/>
+          <w:sz w:val="36"/>
+        </w:rPr>
+        <w:t>5. DOSYA HİYERARŞİSİ</w:t>
+      </w:r>
+    </w:p>
+    <w:p>
+      <w:pPr>
+        <w:spacing w:line="360" w:lineRule="auto" w:after="160"/>
+        <w:jc w:val="both"/>
+      </w:pPr>
+      <w:r>
+        <w:rPr>
+          <w:rFonts w:ascii="Times New Roman" w:hAnsi="Times New Roman"/>
+          <w:sz w:val="24"/>
+        </w:rPr>
+        <w:t>BorsaNeuron projesinin veri hazırlığı, model eğitimi ve Streamlit kullanıcı arayüzü dosyalarını ayıran klasör dizin yapısı aşağıda sunulmuştur:</w:t>
       </w:r>
     </w:p>
     <w:p>
@@ -4796,7 +4878,7 @@
           <w:color w:val="3C3C3C"/>
           <w:sz w:val="19"/>
         </w:rPr>
-        <w:t># Build the Docker image</w:t>
+        <w:t>C:/Users/ibrah/.gemini/antigravity/scratch/ipo_analyzer/</w:t>
       </w:r>
     </w:p>
     <w:p>
@@ -4811,7 +4893,7 @@
           <w:color w:val="3C3C3C"/>
           <w:sz w:val="19"/>
         </w:rPr>
-        <w:t>docker build -t borsaneuron-app:latest .</w:t>
+        <w:t>├── .streamlit/</w:t>
       </w:r>
     </w:p>
     <w:p>
@@ -4826,6 +4908,7 @@
           <w:color w:val="3C3C3C"/>
           <w:sz w:val="19"/>
         </w:rPr>
+        <w:t>│   └── config.toml                  # Streamlit görsel tema ayarları</w:t>
       </w:r>
     </w:p>
     <w:p>
@@ -4840,7 +4923,7 @@
           <w:color w:val="3C3C3C"/>
           <w:sz w:val="19"/>
         </w:rPr>
-        <w:t># Run the container in detached mode with port redirection</w:t>
+        <w:t>├── bist_ai_dataset_real_30cols.csv.xz# LZMA ile sıkıştırılmış veri seti (50.1MB)</w:t>
       </w:r>
     </w:p>
     <w:p>
@@ -4855,20 +4938,232 @@
           <w:color w:val="3C3C3C"/>
           <w:sz w:val="19"/>
         </w:rPr>
-        <w:t>docker run -d -p 80:8501 --name borsaneuron-prod borsaneuron-app:latest</w:t>
-      </w:r>
-    </w:p>
-    <w:p>
-      <w:pPr>
-        <w:spacing w:line="360" w:lineRule="auto" w:after="160"/>
-        <w:jc w:val="both"/>
-      </w:pPr>
-      <w:r>
-        <w:rPr>
-          <w:rFonts w:ascii="Times New Roman" w:hAnsi="Times New Roman"/>
-          <w:sz w:val="24"/>
-        </w:rPr>
-        <w:t>This maps port 8501 of the Streamlit application container directly to port 80 of the host machine, making BorsaNeuron accessible via standard HTTP.</w:t>
+        <w:t>├── best_scaler_acm465.joblib         # Kaydedilmiş standart ölçekleyici ağırlıkları</w:t>
+      </w:r>
+    </w:p>
+    <w:p>
+      <w:pPr>
+        <w:spacing w:before="0" w:after="0"/>
+        <w:ind w:left="720" w:right="720"/>
+        <w:shd w:fill="F4F4F5"/>
+      </w:pPr>
+      <w:r>
+        <w:rPr>
+          <w:rFonts w:ascii="Courier New" w:hAnsi="Courier New"/>
+          <w:color w:val="3C3C3C"/>
+          <w:sz w:val="19"/>
+        </w:rPr>
+        <w:t>├── best_model_acm465.joblib          # Kaydedilmiş MLP Yapay Sinir Ağı ağırlıkları</w:t>
+      </w:r>
+    </w:p>
+    <w:p>
+      <w:pPr>
+        <w:spacing w:before="0" w:after="0"/>
+        <w:ind w:left="720" w:right="720"/>
+        <w:shd w:fill="F4F4F5"/>
+      </w:pPr>
+      <w:r>
+        <w:rPr>
+          <w:rFonts w:ascii="Courier New" w:hAnsi="Courier New"/>
+          <w:color w:val="3C3C3C"/>
+          <w:sz w:val="19"/>
+        </w:rPr>
+        <w:t>├── acm465_proje.py                   # Çevrimdışı modelleme ve test komut dosyası</w:t>
+      </w:r>
+    </w:p>
+    <w:p>
+      <w:pPr>
+        <w:spacing w:before="0" w:after="0"/>
+        <w:ind w:left="720" w:right="720"/>
+        <w:shd w:fill="F4F4F5"/>
+      </w:pPr>
+      <w:r>
+        <w:rPr>
+          <w:rFonts w:ascii="Courier New" w:hAnsi="Courier New"/>
+          <w:color w:val="3C3C3C"/>
+          <w:sz w:val="19"/>
+        </w:rPr>
+        <w:t>├── requirements.txt                  # Bağımlı olunan Python kütüphaneleri listesi</w:t>
+      </w:r>
+    </w:p>
+    <w:p>
+      <w:pPr>
+        <w:spacing w:before="0" w:after="0"/>
+        <w:ind w:left="720" w:right="720"/>
+        <w:shd w:fill="F4F4F5"/>
+      </w:pPr>
+      <w:r>
+        <w:rPr>
+          <w:rFonts w:ascii="Courier New" w:hAnsi="Courier New"/>
+          <w:color w:val="3C3C3C"/>
+          <w:sz w:val="19"/>
+        </w:rPr>
+        <w:t>├── start.bat                         # Kolay çalıştırma kısayolu batch dosyası</w:t>
+      </w:r>
+    </w:p>
+    <w:p>
+      <w:pPr>
+        <w:spacing w:before="0" w:after="0"/>
+        <w:ind w:left="720" w:right="720"/>
+        <w:shd w:fill="F4F4F5"/>
+      </w:pPr>
+      <w:r>
+        <w:rPr>
+          <w:rFonts w:ascii="Courier New" w:hAnsi="Courier New"/>
+          <w:color w:val="3C3C3C"/>
+          <w:sz w:val="19"/>
+        </w:rPr>
+        <w:t>├── Dockerfile                        # Docker konteyner yapılandırması</w:t>
+      </w:r>
+    </w:p>
+    <w:p>
+      <w:pPr>
+        <w:spacing w:before="0" w:after="0"/>
+        <w:ind w:left="720" w:right="720"/>
+        <w:shd w:fill="F4F4F5"/>
+      </w:pPr>
+      <w:r>
+        <w:rPr>
+          <w:rFonts w:ascii="Courier New" w:hAnsi="Courier New"/>
+          <w:color w:val="3C3C3C"/>
+          <w:sz w:val="19"/>
+        </w:rPr>
+        <w:t>├── src/</w:t>
+      </w:r>
+    </w:p>
+    <w:p>
+      <w:pPr>
+        <w:spacing w:before="0" w:after="0"/>
+        <w:ind w:left="720" w:right="720"/>
+        <w:shd w:fill="F4F4F5"/>
+      </w:pPr>
+      <w:r>
+        <w:rPr>
+          <w:rFonts w:ascii="Courier New" w:hAnsi="Courier New"/>
+          <w:color w:val="3C3C3C"/>
+          <w:sz w:val="19"/>
+        </w:rPr>
+        <w:t>│   ├── __init__.py</w:t>
+      </w:r>
+    </w:p>
+    <w:p>
+      <w:pPr>
+        <w:spacing w:before="0" w:after="0"/>
+        <w:ind w:left="720" w:right="720"/>
+        <w:shd w:fill="F4F4F5"/>
+      </w:pPr>
+      <w:r>
+        <w:rPr>
+          <w:rFonts w:ascii="Courier New" w:hAnsi="Courier New"/>
+          <w:color w:val="3C3C3C"/>
+          <w:sz w:val="19"/>
+        </w:rPr>
+        <w:t>│   ├── app.py                        # Streamlit web uygulaması ana dosyası</w:t>
+      </w:r>
+    </w:p>
+    <w:p>
+      <w:pPr>
+        <w:spacing w:before="0" w:after="0"/>
+        <w:ind w:left="720" w:right="720"/>
+        <w:shd w:fill="F4F4F5"/>
+      </w:pPr>
+      <w:r>
+        <w:rPr>
+          <w:rFonts w:ascii="Courier New" w:hAnsi="Courier New"/>
+          <w:color w:val="3C3C3C"/>
+          <w:sz w:val="19"/>
+        </w:rPr>
+        <w:t>│   ├── theme.py                      # Glassmorphic UI renk kodları ve stiller</w:t>
+      </w:r>
+    </w:p>
+    <w:p>
+      <w:pPr>
+        <w:spacing w:before="0" w:after="0"/>
+        <w:ind w:left="720" w:right="720"/>
+        <w:shd w:fill="F4F4F5"/>
+      </w:pPr>
+      <w:r>
+        <w:rPr>
+          <w:rFonts w:ascii="Courier New" w:hAnsi="Courier New"/>
+          <w:color w:val="3C3C3C"/>
+          <w:sz w:val="19"/>
+        </w:rPr>
+        <w:t>│   ├── data_manager.py               # yfinance veri çekme ve önişleme modülü</w:t>
+      </w:r>
+    </w:p>
+    <w:p>
+      <w:pPr>
+        <w:spacing w:before="0" w:after="0"/>
+        <w:ind w:left="720" w:right="720"/>
+        <w:shd w:fill="F4F4F5"/>
+      </w:pPr>
+      <w:r>
+        <w:rPr>
+          <w:rFonts w:ascii="Courier New" w:hAnsi="Courier New"/>
+          <w:color w:val="3C3C3C"/>
+          <w:sz w:val="19"/>
+        </w:rPr>
+        <w:t>│   ├── earnings_data.py              # Şirket finansal veri modelleri</w:t>
+      </w:r>
+    </w:p>
+    <w:p>
+      <w:pPr>
+        <w:spacing w:before="0" w:after="0"/>
+        <w:ind w:left="720" w:right="720"/>
+        <w:shd w:fill="F4F4F5"/>
+      </w:pPr>
+      <w:r>
+        <w:rPr>
+          <w:rFonts w:ascii="Courier New" w:hAnsi="Courier New"/>
+          <w:color w:val="3C3C3C"/>
+          <w:sz w:val="19"/>
+        </w:rPr>
+        <w:t>│   ├── macro_data.py                 # Makroekonomik gösterge veri yapısı</w:t>
+      </w:r>
+    </w:p>
+    <w:p>
+      <w:pPr>
+        <w:spacing w:before="0" w:after="0"/>
+        <w:ind w:left="720" w:right="720"/>
+        <w:shd w:fill="F4F4F5"/>
+      </w:pPr>
+      <w:r>
+        <w:rPr>
+          <w:rFonts w:ascii="Courier New" w:hAnsi="Courier New"/>
+          <w:color w:val="3C3C3C"/>
+          <w:sz w:val="19"/>
+        </w:rPr>
+        <w:t>│   └── verify_tobo_strict.py         # TOBO ve Çanak formasyon test ve tarama kodları</w:t>
+      </w:r>
+    </w:p>
+    <w:p>
+      <w:pPr>
+        <w:spacing w:before="0" w:after="0"/>
+        <w:ind w:left="720" w:right="720"/>
+        <w:shd w:fill="F4F4F5"/>
+      </w:pPr>
+      <w:r>
+        <w:rPr>
+          <w:rFonts w:ascii="Courier New" w:hAnsi="Courier New"/>
+          <w:color w:val="3C3C3C"/>
+          <w:sz w:val="19"/>
+        </w:rPr>
+        <w:t>└── tests/</w:t>
+      </w:r>
+    </w:p>
+    <w:p>
+      <w:pPr>
+        <w:spacing w:before="0" w:after="0"/>
+        <w:ind w:left="720" w:right="720"/>
+        <w:shd w:fill="F4F4F5"/>
+      </w:pPr>
+      <w:r>
+        <w:rPr>
+          <w:rFonts w:ascii="Courier New" w:hAnsi="Courier New"/>
+          <w:color w:val="3C3C3C"/>
+          <w:sz w:val="19"/>
+        </w:rPr>
+        <w:t xml:space="preserve">    └── test_features.py              # İndikatör doğruluğunu sınayan birim testleri</w:t>
       </w:r>
     </w:p>
     <w:p>
@@ -4889,7 +5184,7 @@
           <w:color w:val="111111"/>
           <w:sz w:val="36"/>
         </w:rPr>
-        <w:t>5. FILE HIERARCHY</w:t>
+        <w:t>6. KISITLAR VE GELECEK ÇALIŞMALAR</w:t>
       </w:r>
     </w:p>
     <w:p>
@@ -4902,307 +5197,119 @@
           <w:rFonts w:ascii="Times New Roman" w:hAnsi="Times New Roman"/>
           <w:sz w:val="24"/>
         </w:rPr>
-        <w:t>The complete directory tree of the BorsaNeuron graduation project is structured as follows, separating offline modeling from the online Streamlit interface:</w:t>
-      </w:r>
-    </w:p>
-    <w:p>
-      <w:pPr>
-        <w:spacing w:before="0" w:after="0"/>
-        <w:ind w:left="720" w:right="720"/>
-        <w:shd w:fill="F4F4F5"/>
-      </w:pPr>
-      <w:r>
-        <w:rPr>
-          <w:rFonts w:ascii="Courier New" w:hAnsi="Courier New"/>
-          <w:color w:val="3C3C3C"/>
-          <w:sz w:val="19"/>
-        </w:rPr>
-        <w:t>C:/Users/ibrah/.gemini/antigravity/scratch/ipo_analyzer/</w:t>
-      </w:r>
-    </w:p>
-    <w:p>
-      <w:pPr>
-        <w:spacing w:before="0" w:after="0"/>
-        <w:ind w:left="720" w:right="720"/>
-        <w:shd w:fill="F4F4F5"/>
-      </w:pPr>
-      <w:r>
-        <w:rPr>
-          <w:rFonts w:ascii="Courier New" w:hAnsi="Courier New"/>
-          <w:color w:val="3C3C3C"/>
-          <w:sz w:val="19"/>
-        </w:rPr>
-        <w:t>├── .streamlit/</w:t>
-      </w:r>
-    </w:p>
-    <w:p>
-      <w:pPr>
-        <w:spacing w:before="0" w:after="0"/>
-        <w:ind w:left="720" w:right="720"/>
-        <w:shd w:fill="F4F4F5"/>
-      </w:pPr>
-      <w:r>
-        <w:rPr>
-          <w:rFonts w:ascii="Courier New" w:hAnsi="Courier New"/>
-          <w:color w:val="3C3C3C"/>
-          <w:sz w:val="19"/>
-        </w:rPr>
-        <w:t>│   └── config.toml                  # UI configuration settings</w:t>
-      </w:r>
-    </w:p>
-    <w:p>
-      <w:pPr>
-        <w:spacing w:before="0" w:after="0"/>
-        <w:ind w:left="720" w:right="720"/>
-        <w:shd w:fill="F4F4F5"/>
-      </w:pPr>
-      <w:r>
-        <w:rPr>
-          <w:rFonts w:ascii="Courier New" w:hAnsi="Courier New"/>
-          <w:color w:val="3C3C3C"/>
-          <w:sz w:val="19"/>
-        </w:rPr>
-        <w:t>├── bist_ai_dataset_real_30cols.csv.xz# Compressed xz dataset (50.1MB)</w:t>
-      </w:r>
-    </w:p>
-    <w:p>
-      <w:pPr>
-        <w:spacing w:before="0" w:after="0"/>
-        <w:ind w:left="720" w:right="720"/>
-        <w:shd w:fill="F4F4F5"/>
-      </w:pPr>
-      <w:r>
-        <w:rPr>
-          <w:rFonts w:ascii="Courier New" w:hAnsi="Courier New"/>
-          <w:color w:val="3C3C3C"/>
-          <w:sz w:val="19"/>
-        </w:rPr>
-        <w:t>├── best_scaler_acm465.joblib         # Serialized StandardScaler weights</w:t>
-      </w:r>
-    </w:p>
-    <w:p>
-      <w:pPr>
-        <w:spacing w:before="0" w:after="0"/>
-        <w:ind w:left="720" w:right="720"/>
-        <w:shd w:fill="F4F4F5"/>
-      </w:pPr>
-      <w:r>
-        <w:rPr>
-          <w:rFonts w:ascii="Courier New" w:hAnsi="Courier New"/>
-          <w:color w:val="3C3C3C"/>
-          <w:sz w:val="19"/>
-        </w:rPr>
-        <w:t>├── best_model_acm465.joblib          # Serialized MLP Neural Network weights</w:t>
-      </w:r>
-    </w:p>
-    <w:p>
-      <w:pPr>
-        <w:spacing w:before="0" w:after="0"/>
-        <w:ind w:left="720" w:right="720"/>
-        <w:shd w:fill="F4F4F5"/>
-      </w:pPr>
-      <w:r>
-        <w:rPr>
-          <w:rFonts w:ascii="Courier New" w:hAnsi="Courier New"/>
-          <w:color w:val="3C3C3C"/>
-          <w:sz w:val="19"/>
-        </w:rPr>
-        <w:t>├── acm465_proje.py                   # Offline Data Mining and Modeling Pipeline</w:t>
-      </w:r>
-    </w:p>
-    <w:p>
-      <w:pPr>
-        <w:spacing w:before="0" w:after="0"/>
-        <w:ind w:left="720" w:right="720"/>
-        <w:shd w:fill="F4F4F5"/>
-      </w:pPr>
-      <w:r>
-        <w:rPr>
-          <w:rFonts w:ascii="Courier New" w:hAnsi="Courier New"/>
-          <w:color w:val="3C3C3C"/>
-          <w:sz w:val="19"/>
-        </w:rPr>
-        <w:t>├── requirements.txt                  # Python package dependency list</w:t>
-      </w:r>
-    </w:p>
-    <w:p>
-      <w:pPr>
-        <w:spacing w:before="0" w:after="0"/>
-        <w:ind w:left="720" w:right="720"/>
-        <w:shd w:fill="F4F4F5"/>
-      </w:pPr>
-      <w:r>
-        <w:rPr>
-          <w:rFonts w:ascii="Courier New" w:hAnsi="Courier New"/>
-          <w:color w:val="3C3C3C"/>
-          <w:sz w:val="19"/>
-        </w:rPr>
-        <w:t>├── start.bat                         # Startup shortcut batch script</w:t>
-      </w:r>
-    </w:p>
-    <w:p>
-      <w:pPr>
-        <w:spacing w:before="0" w:after="0"/>
-        <w:ind w:left="720" w:right="720"/>
-        <w:shd w:fill="F4F4F5"/>
-      </w:pPr>
-      <w:r>
-        <w:rPr>
-          <w:rFonts w:ascii="Courier New" w:hAnsi="Courier New"/>
-          <w:color w:val="3C3C3C"/>
-          <w:sz w:val="19"/>
-        </w:rPr>
-        <w:t>├── Dockerfile                        # Docker container manifest</w:t>
-      </w:r>
-    </w:p>
-    <w:p>
-      <w:pPr>
-        <w:spacing w:before="0" w:after="0"/>
-        <w:ind w:left="720" w:right="720"/>
-        <w:shd w:fill="F4F4F5"/>
-      </w:pPr>
-      <w:r>
-        <w:rPr>
-          <w:rFonts w:ascii="Courier New" w:hAnsi="Courier New"/>
-          <w:color w:val="3C3C3C"/>
-          <w:sz w:val="19"/>
-        </w:rPr>
-        <w:t>├── src/</w:t>
-      </w:r>
-    </w:p>
-    <w:p>
-      <w:pPr>
-        <w:spacing w:before="0" w:after="0"/>
-        <w:ind w:left="720" w:right="720"/>
-        <w:shd w:fill="F4F4F5"/>
-      </w:pPr>
-      <w:r>
-        <w:rPr>
-          <w:rFonts w:ascii="Courier New" w:hAnsi="Courier New"/>
-          <w:color w:val="3C3C3C"/>
-          <w:sz w:val="19"/>
-        </w:rPr>
-        <w:t>│   ├── __init__.py</w:t>
-      </w:r>
-    </w:p>
-    <w:p>
-      <w:pPr>
-        <w:spacing w:before="0" w:after="0"/>
-        <w:ind w:left="720" w:right="720"/>
-        <w:shd w:fill="F4F4F5"/>
-      </w:pPr>
-      <w:r>
-        <w:rPr>
-          <w:rFonts w:ascii="Courier New" w:hAnsi="Courier New"/>
-          <w:color w:val="3C3C3C"/>
-          <w:sz w:val="19"/>
-        </w:rPr>
-        <w:t>│   ├── app.py                        # Streamlit Web Application entrypoint</w:t>
-      </w:r>
-    </w:p>
-    <w:p>
-      <w:pPr>
-        <w:spacing w:before="0" w:after="0"/>
-        <w:ind w:left="720" w:right="720"/>
-        <w:shd w:fill="F4F4F5"/>
-      </w:pPr>
-      <w:r>
-        <w:rPr>
-          <w:rFonts w:ascii="Courier New" w:hAnsi="Courier New"/>
-          <w:color w:val="3C3C3C"/>
-          <w:sz w:val="19"/>
-        </w:rPr>
-        <w:t>│   ├── theme.py                      # UI Color schemas and styling utilities</w:t>
-      </w:r>
-    </w:p>
-    <w:p>
-      <w:pPr>
-        <w:spacing w:before="0" w:after="0"/>
-        <w:ind w:left="720" w:right="720"/>
-        <w:shd w:fill="F4F4F5"/>
-      </w:pPr>
-      <w:r>
-        <w:rPr>
-          <w:rFonts w:ascii="Courier New" w:hAnsi="Courier New"/>
-          <w:color w:val="3C3C3C"/>
-          <w:sz w:val="19"/>
-        </w:rPr>
-        <w:t>│   ├── data_manager.py               # Data loaders and yfinance API client</w:t>
-      </w:r>
-    </w:p>
-    <w:p>
-      <w:pPr>
-        <w:spacing w:before="0" w:after="0"/>
-        <w:ind w:left="720" w:right="720"/>
-        <w:shd w:fill="F4F4F5"/>
-      </w:pPr>
-      <w:r>
-        <w:rPr>
-          <w:rFonts w:ascii="Courier New" w:hAnsi="Courier New"/>
-          <w:color w:val="3C3C3C"/>
-          <w:sz w:val="19"/>
-        </w:rPr>
-        <w:t>│   ├── earnings_data.py              # Macro-corporate data structures</w:t>
-      </w:r>
-    </w:p>
-    <w:p>
-      <w:pPr>
-        <w:spacing w:before="0" w:after="0"/>
-        <w:ind w:left="720" w:right="720"/>
-        <w:shd w:fill="F4F4F5"/>
-      </w:pPr>
-      <w:r>
-        <w:rPr>
-          <w:rFonts w:ascii="Courier New" w:hAnsi="Courier New"/>
-          <w:color w:val="3C3C3C"/>
-          <w:sz w:val="19"/>
-        </w:rPr>
-        <w:t>│   ├── macro_data.py                 # Macroeconomic data parsers</w:t>
-      </w:r>
-    </w:p>
-    <w:p>
-      <w:pPr>
-        <w:spacing w:before="0" w:after="0"/>
-        <w:ind w:left="720" w:right="720"/>
-        <w:shd w:fill="F4F4F5"/>
-      </w:pPr>
-      <w:r>
-        <w:rPr>
-          <w:rFonts w:ascii="Courier New" w:hAnsi="Courier New"/>
-          <w:color w:val="3C3C3C"/>
-          <w:sz w:val="19"/>
-        </w:rPr>
-        <w:t>│   └── verify_tobo_strict.py         # TOBO and Cup-Handle pattern scanners</w:t>
-      </w:r>
-    </w:p>
-    <w:p>
-      <w:pPr>
-        <w:spacing w:before="0" w:after="0"/>
-        <w:ind w:left="720" w:right="720"/>
-        <w:shd w:fill="F4F4F5"/>
-      </w:pPr>
-      <w:r>
-        <w:rPr>
-          <w:rFonts w:ascii="Courier New" w:hAnsi="Courier New"/>
-          <w:color w:val="3C3C3C"/>
-          <w:sz w:val="19"/>
-        </w:rPr>
-        <w:t>└── tests/</w:t>
-      </w:r>
-    </w:p>
-    <w:p>
-      <w:pPr>
-        <w:spacing w:before="0" w:after="0"/>
-        <w:ind w:left="720" w:right="720"/>
-        <w:shd w:fill="F4F4F5"/>
-      </w:pPr>
-      <w:r>
-        <w:rPr>
-          <w:rFonts w:ascii="Courier New" w:hAnsi="Courier New"/>
-          <w:color w:val="3C3C3C"/>
-          <w:sz w:val="19"/>
-        </w:rPr>
-        <w:t xml:space="preserve">    └── test_features.py              # Unit tests for technical indicator vectors</w:t>
+        <w:t>BorsaNeuron platformunda kullanılan makine öğrenmesi modelleri ve teknik analiz algoritmaları, tarihsel fiyat hareketleri ve bunlardan türetilen matematiksel indikatörler ile sınırlıdır. Finansal piyasalar, doğası gereği yarı etkin (semi-strong efficient) piyasa yapısındadır ve fiyatlar yalnızca geçmiş verilerden değil, aynı zamanda dışsal şoklardan da etkilenir.</w:t>
+      </w:r>
+    </w:p>
+    <w:p>
+      <w:pPr>
+        <w:spacing w:line="360" w:lineRule="auto" w:after="160"/>
+        <w:jc w:val="both"/>
+      </w:pPr>
+      <w:r>
+        <w:rPr>
+          <w:rFonts w:ascii="Times New Roman" w:hAnsi="Times New Roman"/>
+          <w:b/>
+          <w:sz w:val="24"/>
+        </w:rPr>
+        <w:t>Platformun Temel Kısıtları:</w:t>
+      </w:r>
+    </w:p>
+    <w:p>
+      <w:pPr>
+        <w:spacing w:line="360" w:lineRule="auto" w:after="160"/>
+        <w:jc w:val="both"/>
+      </w:pPr>
+      <w:r>
+        <w:rPr>
+          <w:rFonts w:ascii="Times New Roman" w:hAnsi="Times New Roman"/>
+          <w:sz w:val="24"/>
+        </w:rPr>
+        <w:t xml:space="preserve">1.  </w:t>
+      </w:r>
+      <w:r>
+        <w:rPr>
+          <w:rFonts w:ascii="Times New Roman" w:hAnsi="Times New Roman"/>
+          <w:b/>
+          <w:sz w:val="24"/>
+        </w:rPr>
+        <w:t>Makro Şoklar ve Haber Akışları:</w:t>
+      </w:r>
+      <w:r>
+        <w:rPr>
+          <w:rFonts w:ascii="Times New Roman" w:hAnsi="Times New Roman"/>
+          <w:sz w:val="24"/>
+        </w:rPr>
+        <w:t xml:space="preserve"> TCMB faiz kararları, enflasyon açıklamaları, küresel jeopolitik gerilimler veya şirketlerin KAP'a (Kamuyu Aydınlatma Platformu) bildirdiği ani maddi durum açıklamaları, teknik indikatörlerin ürettiği sinyalleri geçersiz kılabilmektedir.</w:t>
+      </w:r>
+    </w:p>
+    <w:p>
+      <w:pPr>
+        <w:spacing w:line="360" w:lineRule="auto" w:after="160"/>
+        <w:jc w:val="both"/>
+      </w:pPr>
+      <w:r>
+        <w:rPr>
+          <w:rFonts w:ascii="Times New Roman" w:hAnsi="Times New Roman"/>
+          <w:sz w:val="24"/>
+        </w:rPr>
+        <w:t xml:space="preserve">2.  </w:t>
+      </w:r>
+      <w:r>
+        <w:rPr>
+          <w:rFonts w:ascii="Times New Roman" w:hAnsi="Times New Roman"/>
+          <w:b/>
+          <w:sz w:val="24"/>
+        </w:rPr>
+        <w:t>Sızıntı Riski (Look-Ahead Bias):</w:t>
+      </w:r>
+      <w:r>
+        <w:rPr>
+          <w:rFonts w:ascii="Times New Roman" w:hAnsi="Times New Roman"/>
+          <w:sz w:val="24"/>
+        </w:rPr>
+        <w:t xml:space="preserve"> Canlı çıkarım esnasında yfinance veri akışındaki anlık gecikmeler veya güncellenmemiş veriler geçici kararsızlıklara yol açabilir.</w:t>
+      </w:r>
+    </w:p>
+    <w:p>
+      <w:pPr>
+        <w:spacing w:line="360" w:lineRule="auto" w:after="160"/>
+        <w:jc w:val="both"/>
+      </w:pPr>
+      <w:r>
+        <w:rPr>
+          <w:rFonts w:ascii="Times New Roman" w:hAnsi="Times New Roman"/>
+          <w:b/>
+          <w:sz w:val="24"/>
+        </w:rPr>
+        <w:t>Gelecek Çalışmalar ve Hedefler:</w:t>
+      </w:r>
+    </w:p>
+    <w:p>
+      <w:pPr>
+        <w:spacing w:line="360" w:lineRule="auto" w:after="160"/>
+        <w:jc w:val="both"/>
+      </w:pPr>
+      <w:r>
+        <w:rPr>
+          <w:rFonts w:ascii="Times New Roman" w:hAnsi="Times New Roman"/>
+          <w:sz w:val="24"/>
+        </w:rPr>
+        <w:t xml:space="preserve">Yapay zeka çıkarımlarının güvenilirliğini artırmak amacıyla, sisteme bir </w:t>
+      </w:r>
+      <w:r>
+        <w:rPr>
+          <w:rFonts w:ascii="Times New Roman" w:hAnsi="Times New Roman"/>
+          <w:b/>
+          <w:sz w:val="24"/>
+        </w:rPr>
+        <w:t>Doğal Dil İşleme (NLP)</w:t>
+      </w:r>
+      <w:r>
+        <w:rPr>
+          <w:rFonts w:ascii="Times New Roman" w:hAnsi="Times New Roman"/>
+          <w:sz w:val="24"/>
+        </w:rPr>
+        <w:t xml:space="preserve"> modülü eklenmesi planlanmaktadır. Bu modül, KAP bildirimlerini ve finansal haber başlıklarını canlı olarak tarayarak duygu analizi (sentiment analysis) skorları üretecektir. Elde edilen bu duygu skorları, BorsaNeuron'un teknik analiz modeline birer ek özellik (feature) olarak beslenecek ve teknik veri ile temel veriyi birleştiren hibrit bir karar destek motoru oluşturulacaktır.</w:t>
       </w:r>
     </w:p>
     <w:p>
@@ -5223,7 +5330,7 @@
           <w:color w:val="111111"/>
           <w:sz w:val="36"/>
         </w:rPr>
-        <w:t>TECH STACK</w:t>
+        <w:t>TEKNOLOJİ YIĞINI</w:t>
       </w:r>
     </w:p>
     <w:tbl>
@@ -5260,7 +5367,7 @@
                 <w:b/>
                 <w:sz w:val="21"/>
               </w:rPr>
-              <w:t>Stack Layer</w:t>
+              <w:t>Katman</w:t>
             </w:r>
           </w:p>
         </w:tc>
@@ -5286,7 +5393,7 @@
                 <w:b/>
                 <w:sz w:val="21"/>
               </w:rPr>
-              <w:t>Technologies Used</w:t>
+              <w:t>Kullanılan Teknolojiler</w:t>
             </w:r>
           </w:p>
         </w:tc>
@@ -5312,7 +5419,7 @@
                 <w:b/>
                 <w:sz w:val="21"/>
               </w:rPr>
-              <w:t>Purpose</w:t>
+              <w:t>Kullanım Amacı</w:t>
             </w:r>
           </w:p>
         </w:tc>
@@ -5338,7 +5445,7 @@
                 <w:rFonts w:ascii="Times New Roman" w:hAnsi="Times New Roman"/>
                 <w:sz w:val="21"/>
               </w:rPr>
-              <w:t>**Core Programming**</w:t>
+              <w:t>**Programlama Dili**</w:t>
             </w:r>
           </w:p>
         </w:tc>
@@ -5386,7 +5493,7 @@
                 <w:rFonts w:ascii="Times New Roman" w:hAnsi="Times New Roman"/>
                 <w:sz w:val="21"/>
               </w:rPr>
-              <w:t>Main scientific computation language</w:t>
+              <w:t>Tüm bilimsel hesaplamalar ve ana kod tabanı</w:t>
             </w:r>
           </w:p>
         </w:tc>
@@ -5412,7 +5519,7 @@
                 <w:rFonts w:ascii="Times New Roman" w:hAnsi="Times New Roman"/>
                 <w:sz w:val="21"/>
               </w:rPr>
-              <w:t>**Data Engineering**</w:t>
+              <w:t>**Veri Mühendisliği**</w:t>
             </w:r>
           </w:p>
         </w:tc>
@@ -5460,7 +5567,7 @@
                 <w:rFonts w:ascii="Times New Roman" w:hAnsi="Times New Roman"/>
                 <w:sz w:val="21"/>
               </w:rPr>
-              <w:t>Data parsing, array operations, features calculation</w:t>
+              <w:t>Veri önişleme, dizi operasyonları ve indikatör hesaplamaları</w:t>
             </w:r>
           </w:p>
         </w:tc>
@@ -5486,7 +5593,7 @@
                 <w:rFonts w:ascii="Times New Roman" w:hAnsi="Times New Roman"/>
                 <w:sz w:val="21"/>
               </w:rPr>
-              <w:t>**Data Fetching**</w:t>
+              <w:t>**Canlı Veri Akışı**</w:t>
             </w:r>
           </w:p>
         </w:tc>
@@ -5534,7 +5641,7 @@
                 <w:rFonts w:ascii="Times New Roman" w:hAnsi="Times New Roman"/>
                 <w:sz w:val="21"/>
               </w:rPr>
-              <w:t>Dynamic streaming of daily candle data</w:t>
+              <w:t>Günlük mum fiyatlarının anlık olarak indirilmesi</w:t>
             </w:r>
           </w:p>
         </w:tc>
@@ -5560,7 +5667,7 @@
                 <w:rFonts w:ascii="Times New Roman" w:hAnsi="Times New Roman"/>
                 <w:sz w:val="21"/>
               </w:rPr>
-              <w:t>**Data Mining &amp; Clustering**</w:t>
+              <w:t>**Veri Madenciliği**</w:t>
             </w:r>
           </w:p>
         </w:tc>
@@ -5608,7 +5715,7 @@
                 <w:rFonts w:ascii="Times New Roman" w:hAnsi="Times New Roman"/>
                 <w:sz w:val="21"/>
               </w:rPr>
-              <w:t>Market regime classification and dimensionality reduction</w:t>
+              <w:t>Piyasa segmentasyonu ve boyut azaltma analizi</w:t>
             </w:r>
           </w:p>
         </w:tc>
@@ -5634,7 +5741,7 @@
                 <w:rFonts w:ascii="Times New Roman" w:hAnsi="Times New Roman"/>
                 <w:sz w:val="21"/>
               </w:rPr>
-              <w:t>**Predictive Modeling**</w:t>
+              <w:t>**Yapay Zeka Modelleri**</w:t>
             </w:r>
           </w:p>
         </w:tc>
@@ -5658,7 +5765,7 @@
                 <w:rFonts w:ascii="Times New Roman" w:hAnsi="Times New Roman"/>
                 <w:sz w:val="21"/>
               </w:rPr>
-              <w:t>MLPClassifier (ANN), RandomForest, K-NN</w:t>
+              <w:t>MLPClassifier, RandomForest, K-NN</w:t>
             </w:r>
           </w:p>
         </w:tc>
@@ -5682,7 +5789,7 @@
                 <w:rFonts w:ascii="Times New Roman" w:hAnsi="Times New Roman"/>
                 <w:sz w:val="21"/>
               </w:rPr>
-              <w:t>Future price direction classification</w:t>
+              <w:t>Gelecek fiyat yönünü tahmin eden sınıflandırıcılar</w:t>
             </w:r>
           </w:p>
         </w:tc>
@@ -5708,7 +5815,7 @@
                 <w:rFonts w:ascii="Times New Roman" w:hAnsi="Times New Roman"/>
                 <w:sz w:val="21"/>
               </w:rPr>
-              <w:t>**Serialization**</w:t>
+              <w:t>**Model Kaydetme**</w:t>
             </w:r>
           </w:p>
         </w:tc>
@@ -5756,7 +5863,7 @@
                 <w:rFonts w:ascii="Times New Roman" w:hAnsi="Times New Roman"/>
                 <w:sz w:val="21"/>
               </w:rPr>
-              <w:t>Serializing trained weights and preprocessing scales</w:t>
+              <w:t>Eğitilen model ve ölçekleyicilerin diske yazılması/okunması</w:t>
             </w:r>
           </w:p>
         </w:tc>
@@ -5782,7 +5889,7 @@
                 <w:rFonts w:ascii="Times New Roman" w:hAnsi="Times New Roman"/>
                 <w:sz w:val="21"/>
               </w:rPr>
-              <w:t>**Interactive UI**</w:t>
+              <w:t>**Kullanıcı Arayüzü**</w:t>
             </w:r>
           </w:p>
         </w:tc>
@@ -5830,7 +5937,7 @@
                 <w:rFonts w:ascii="Times New Roman" w:hAnsi="Times New Roman"/>
                 <w:sz w:val="21"/>
               </w:rPr>
-              <w:t>Premium dark-themed business intelligence frontend</w:t>
+              <w:t>Koyu temalı, glassmorphic SaaS iş istasyonu arayüzü</w:t>
             </w:r>
           </w:p>
         </w:tc>
@@ -5856,7 +5963,7 @@
                 <w:rFonts w:ascii="Times New Roman" w:hAnsi="Times New Roman"/>
                 <w:sz w:val="21"/>
               </w:rPr>
-              <w:t>**Visualizations**</w:t>
+              <w:t>**Görselleştirme**</w:t>
             </w:r>
           </w:p>
         </w:tc>
@@ -5904,7 +6011,7 @@
                 <w:rFonts w:ascii="Times New Roman" w:hAnsi="Times New Roman"/>
                 <w:sz w:val="21"/>
               </w:rPr>
-              <w:t>Dynamic Candlesticks, backtesting curves, PCA plots</w:t>
+              <w:t>Etkileşimli mum grafikleri, getiri eğrileri, PCA dağılımları</w:t>
             </w:r>
           </w:p>
         </w:tc>
@@ -5930,7 +6037,7 @@
                 <w:rFonts w:ascii="Times New Roman" w:hAnsi="Times New Roman"/>
                 <w:sz w:val="21"/>
               </w:rPr>
-              <w:t>**Containerization**</w:t>
+              <w:t>**Dağıtım**</w:t>
             </w:r>
           </w:p>
         </w:tc>
@@ -5978,7 +6085,7 @@
                 <w:rFonts w:ascii="Times New Roman" w:hAnsi="Times New Roman"/>
                 <w:sz w:val="21"/>
               </w:rPr>
-              <w:t>Ensuring platform portability and CI/CD pipelines</w:t>
+              <w:t>Sunucu bağımsız dağıtım ve CI/CD süreçlerinin kolaylaştırılması</w:t>
             </w:r>
           </w:p>
         </w:tc>
@@ -6002,7 +6109,7 @@
           <w:color w:val="111111"/>
           <w:sz w:val="36"/>
         </w:rPr>
-        <w:t>REFERENCES</w:t>
+        <w:t>KAYNAKÇA</w:t>
       </w:r>
     </w:p>
     <w:p>
@@ -6058,7 +6165,7 @@
           <w:rFonts w:ascii="Times New Roman" w:hAnsi="Times New Roman"/>
           <w:sz w:val="24"/>
         </w:rPr>
-        <w:t>. Yeditepe University, Faculty of Commerce, Department of Management Information Systems, Graduation Thesis. (Supervised by Dr. Lecturer Uğur Tevfik Kaplancalı)</w:t>
+        <w:t>. Yeditepe Üniversitesi, Ticari Bilimler Fakültesi, Yönetim Bilişim Sistemleri Bölümü, Lisans Tezi. (Tez Danışmanı: Dr. Öğr. Üyesi Uğur Tevfik Kaplancalı)</w:t>
       </w:r>
     </w:p>
     <w:p>
@@ -6185,7 +6292,7 @@
           <w:rFonts w:ascii="Times New Roman" w:hAnsi="Times New Roman"/>
           <w:sz w:val="24"/>
         </w:rPr>
-        <w:t>. Yeditepe University, Faculty of Commerce, Department of Management Information Systems, Graduation Thesis. (Supervised by Assoc. Prof. Dr. Uğur Tevfik Kaplancalı)</w:t>
+        <w:t>. Yeditepe Üniversitesi, Ticari Bilimler Fakültesi, Yönetim Bilişim Sistemleri Bölümü, Lisans Tezi. (Tez Danışmanı: Doç. Dr. Uğur Tevfik Kaplancalı)</w:t>
       </w:r>
     </w:p>
     <w:p>
@@ -6325,7 +6432,7 @@
           <w:rFonts w:ascii="Times New Roman" w:hAnsi="Times New Roman"/>
           <w:sz w:val="24"/>
         </w:rPr>
-        <w:t>. International Journal of Engineering Research and Development, 11(1), 253-265. https://doi.org/10.29137/umagd.425560</w:t>
+        <w:t>. Uluslararası Mühendislik Araştırma ve Geliştirme Dergisi (UMAGD), 11(1), 253-265. https://doi.org/10.29137/umagd.425560</w:t>
       </w:r>
     </w:p>
     <w:p>
@@ -6381,7 +6488,7 @@
           <w:rFonts w:ascii="Times New Roman" w:hAnsi="Times New Roman"/>
           <w:sz w:val="24"/>
         </w:rPr>
-        <w:t>. Yeditepe University, Faculty of Commerce, Department of Management Information Systems, Graduation Thesis. (Supervised by Dr. Lecturer Uğur Tevfik Kaplancalı)</w:t>
+        <w:t>. Yeditepe Üniversitesi, Ticari Bilimler Fakültesi, Yönetim Bilişim Sistemleri Bölümü, Lisans Tezi. (Tez Danışmanı: Dr. Öğr. Üyesi Uğur Tevfik Kaplancalı)</w:t>
       </w:r>
     </w:p>
     <w:p>

</xml_diff>